<commit_message>
added conversion from png to txt
</commit_message>
<xml_diff>
--- a/2802ict-assignments/assignment_01/Report.docx
+++ b/2802ict-assignments/assignment_01/Report.docx
@@ -1591,8 +1591,13 @@
         <w:t xml:space="preserve"> </w:t>
       </w:r>
       <w:r>
-        <w:t>An explored set is defined</w:t>
-      </w:r>
+        <w:t xml:space="preserve">An explored set is </w:t>
+      </w:r>
+      <w:proofErr w:type="gramStart"/>
+      <w:r>
+        <w:t>defined</w:t>
+      </w:r>
+      <w:proofErr w:type="gramEnd"/>
       <w:r>
         <w:t xml:space="preserve"> and a cutoff</w:t>
       </w:r>
@@ -1603,13 +1608,29 @@
         <w:t>occurred tracking variable is defined.</w:t>
       </w:r>
       <w:r>
-        <w:t xml:space="preserve"> While the frontier is not empty, a node is popped from the frontier, a goal check is made and the node is added to the explored set.</w:t>
+        <w:t xml:space="preserve"> While the frontier is not empty, a node is popped from the frontier, a goal check is </w:t>
+      </w:r>
+      <w:proofErr w:type="gramStart"/>
+      <w:r>
+        <w:t>made</w:t>
+      </w:r>
+      <w:proofErr w:type="gramEnd"/>
+      <w:r>
+        <w:t xml:space="preserve"> and the node is added to the explored set.</w:t>
       </w:r>
       <w:r>
         <w:t xml:space="preserve"> Then for each neighbour</w:t>
       </w:r>
       <w:r>
-        <w:t>, if neighbour depth exceeds max depth, the neighbour is skipped and the cutoff occurred tracking variable is triggered.</w:t>
+        <w:t xml:space="preserve">, if neighbour depth exceeds max depth, the neighbour is </w:t>
+      </w:r>
+      <w:proofErr w:type="gramStart"/>
+      <w:r>
+        <w:t>skipped</w:t>
+      </w:r>
+      <w:proofErr w:type="gramEnd"/>
+      <w:r>
+        <w:t xml:space="preserve"> and the cutoff occurred tracking variable is triggered.</w:t>
       </w:r>
       <w:r>
         <w:t xml:space="preserve"> If not exceeding depth the neighbour is then added to the frontier if not already in the frontier or in the explored set.</w:t>
@@ -1675,7 +1696,15 @@
         <w:t xml:space="preserve">with increasing depths </w:t>
       </w:r>
       <w:r>
-        <w:t>until either a solution is found or some max search depth is reached.</w:t>
+        <w:t xml:space="preserve">until either a solution is </w:t>
+      </w:r>
+      <w:proofErr w:type="gramStart"/>
+      <w:r>
+        <w:t>found</w:t>
+      </w:r>
+      <w:proofErr w:type="gramEnd"/>
+      <w:r>
+        <w:t xml:space="preserve"> or some max search depth is reached.</w:t>
       </w:r>
     </w:p>
     <w:p>
@@ -1791,11 +1820,1189 @@
     </w:p>
     <w:p>
       <w:r>
-        <w:t xml:space="preserve">The Manhattan Heuristic was </w:t>
+        <w:t xml:space="preserve">The Manhattan </w:t>
+      </w:r>
+      <w:r>
+        <w:t>h</w:t>
+      </w:r>
+      <w:r>
+        <w:t xml:space="preserve">euristic was </w:t>
+      </w:r>
+      <w:r>
+        <w:t>chosen as it provides a fast, consistent, admissible heuristic to inform A*.</w:t>
+      </w:r>
+      <w:r>
+        <w:t xml:space="preserve"> The Manhattan heuristic may be defined as follows:</w:t>
+      </w:r>
+    </w:p>
+    <w:p>
+      <m:oMathPara>
+        <m:oMath>
+          <m:r>
+            <w:rPr>
+              <w:rFonts w:ascii="Cambria Math" w:hAnsi="Cambria Math"/>
+            </w:rPr>
+            <m:t>h</m:t>
+          </m:r>
+          <m:d>
+            <m:dPr>
+              <m:ctrlPr>
+                <w:rPr>
+                  <w:rFonts w:ascii="Cambria Math" w:hAnsi="Cambria Math"/>
+                  <w:i/>
+                </w:rPr>
+              </m:ctrlPr>
+            </m:dPr>
+            <m:e>
+              <m:r>
+                <w:rPr>
+                  <w:rFonts w:ascii="Cambria Math" w:hAnsi="Cambria Math"/>
+                </w:rPr>
+                <m:t>n</m:t>
+              </m:r>
+            </m:e>
+          </m:d>
+          <m:r>
+            <w:rPr>
+              <w:rFonts w:ascii="Cambria Math" w:hAnsi="Cambria Math"/>
+            </w:rPr>
+            <m:t>=</m:t>
+          </m:r>
+          <m:d>
+            <m:dPr>
+              <m:begChr m:val="|"/>
+              <m:endChr m:val="|"/>
+              <m:ctrlPr>
+                <w:rPr>
+                  <w:rFonts w:ascii="Cambria Math" w:hAnsi="Cambria Math"/>
+                  <w:i/>
+                </w:rPr>
+              </m:ctrlPr>
+            </m:dPr>
+            <m:e>
+              <m:sSub>
+                <m:sSubPr>
+                  <m:ctrlPr>
+                    <w:rPr>
+                      <w:rFonts w:ascii="Cambria Math" w:hAnsi="Cambria Math"/>
+                      <w:i/>
+                    </w:rPr>
+                  </m:ctrlPr>
+                </m:sSubPr>
+                <m:e>
+                  <m:r>
+                    <w:rPr>
+                      <w:rFonts w:ascii="Cambria Math" w:hAnsi="Cambria Math"/>
+                    </w:rPr>
+                    <m:t>x</m:t>
+                  </m:r>
+                </m:e>
+                <m:sub>
+                  <m:r>
+                    <w:rPr>
+                      <w:rFonts w:ascii="Cambria Math" w:hAnsi="Cambria Math"/>
+                    </w:rPr>
+                    <m:t>n</m:t>
+                  </m:r>
+                </m:sub>
+              </m:sSub>
+              <m:r>
+                <w:rPr>
+                  <w:rFonts w:ascii="Cambria Math" w:hAnsi="Cambria Math"/>
+                </w:rPr>
+                <m:t>-</m:t>
+              </m:r>
+              <m:sSub>
+                <m:sSubPr>
+                  <m:ctrlPr>
+                    <w:rPr>
+                      <w:rFonts w:ascii="Cambria Math" w:hAnsi="Cambria Math"/>
+                      <w:i/>
+                    </w:rPr>
+                  </m:ctrlPr>
+                </m:sSubPr>
+                <m:e>
+                  <m:r>
+                    <w:rPr>
+                      <w:rFonts w:ascii="Cambria Math" w:hAnsi="Cambria Math"/>
+                    </w:rPr>
+                    <m:t>x</m:t>
+                  </m:r>
+                </m:e>
+                <m:sub>
+                  <m:r>
+                    <w:rPr>
+                      <w:rFonts w:ascii="Cambria Math" w:hAnsi="Cambria Math"/>
+                    </w:rPr>
+                    <m:t>goal</m:t>
+                  </m:r>
+                </m:sub>
+              </m:sSub>
+            </m:e>
+          </m:d>
+          <m:r>
+            <w:rPr>
+              <w:rFonts w:ascii="Cambria Math" w:hAnsi="Cambria Math"/>
+            </w:rPr>
+            <m:t>+|</m:t>
+          </m:r>
+          <m:sSub>
+            <m:sSubPr>
+              <m:ctrlPr>
+                <w:rPr>
+                  <w:rFonts w:ascii="Cambria Math" w:hAnsi="Cambria Math"/>
+                  <w:i/>
+                </w:rPr>
+              </m:ctrlPr>
+            </m:sSubPr>
+            <m:e>
+              <m:r>
+                <w:rPr>
+                  <w:rFonts w:ascii="Cambria Math" w:hAnsi="Cambria Math"/>
+                </w:rPr>
+                <m:t>y</m:t>
+              </m:r>
+            </m:e>
+            <m:sub>
+              <m:r>
+                <w:rPr>
+                  <w:rFonts w:ascii="Cambria Math" w:hAnsi="Cambria Math"/>
+                </w:rPr>
+                <m:t>n</m:t>
+              </m:r>
+            </m:sub>
+          </m:sSub>
+          <m:r>
+            <w:rPr>
+              <w:rFonts w:ascii="Cambria Math" w:hAnsi="Cambria Math"/>
+            </w:rPr>
+            <m:t>-</m:t>
+          </m:r>
+          <m:sSub>
+            <m:sSubPr>
+              <m:ctrlPr>
+                <w:rPr>
+                  <w:rFonts w:ascii="Cambria Math" w:hAnsi="Cambria Math"/>
+                  <w:i/>
+                </w:rPr>
+              </m:ctrlPr>
+            </m:sSubPr>
+            <m:e>
+              <m:r>
+                <w:rPr>
+                  <w:rFonts w:ascii="Cambria Math" w:hAnsi="Cambria Math"/>
+                </w:rPr>
+                <m:t>y</m:t>
+              </m:r>
+            </m:e>
+            <m:sub>
+              <m:r>
+                <w:rPr>
+                  <w:rFonts w:ascii="Cambria Math" w:hAnsi="Cambria Math"/>
+                </w:rPr>
+                <m:t>goal</m:t>
+              </m:r>
+            </m:sub>
+          </m:sSub>
+          <m:r>
+            <w:rPr>
+              <w:rFonts w:ascii="Cambria Math" w:hAnsi="Cambria Math"/>
+            </w:rPr>
+            <m:t>|</m:t>
+          </m:r>
+        </m:oMath>
+      </m:oMathPara>
+    </w:p>
+    <w:p>
+      <w:r>
+        <w:t xml:space="preserve">For a heuristic </w:t>
+      </w:r>
+      <m:oMath>
+        <m:r>
+          <w:rPr>
+            <w:rFonts w:ascii="Cambria Math" w:hAnsi="Cambria Math"/>
+          </w:rPr>
+          <m:t>h(n)</m:t>
+        </m:r>
+      </m:oMath>
+      <w:r>
+        <w:rPr>
+          <w:rFonts w:eastAsiaTheme="minorEastAsia"/>
+        </w:rPr>
+        <w:t xml:space="preserve"> </w:t>
+      </w:r>
+      <w:r>
+        <w:t xml:space="preserve">to be consistent, for all nodes </w:t>
+      </w:r>
+      <m:oMath>
+        <m:r>
+          <w:rPr>
+            <w:rFonts w:ascii="Cambria Math" w:hAnsi="Cambria Math"/>
+          </w:rPr>
+          <m:t>n</m:t>
+        </m:r>
+      </m:oMath>
+      <w:r>
+        <w:rPr>
+          <w:rFonts w:eastAsiaTheme="minorEastAsia"/>
+        </w:rPr>
+        <w:t xml:space="preserve"> and </w:t>
+      </w:r>
+      <m:oMath>
+        <m:r>
+          <w:rPr>
+            <w:rFonts w:ascii="Cambria Math" w:eastAsiaTheme="minorEastAsia" w:hAnsi="Cambria Math"/>
+          </w:rPr>
+          <m:t>n'</m:t>
+        </m:r>
+      </m:oMath>
+      <w:r>
+        <w:rPr>
+          <w:rFonts w:eastAsiaTheme="minorEastAsia"/>
+        </w:rPr>
+        <w:t xml:space="preserve">, </w:t>
+      </w:r>
+      <m:oMath>
+        <m:r>
+          <w:rPr>
+            <w:rFonts w:ascii="Cambria Math" w:eastAsiaTheme="minorEastAsia" w:hAnsi="Cambria Math"/>
+          </w:rPr>
+          <m:t>h(n)</m:t>
+        </m:r>
+      </m:oMath>
+      <w:r>
+        <w:rPr>
+          <w:rFonts w:eastAsiaTheme="minorEastAsia"/>
+        </w:rPr>
+        <w:t xml:space="preserve"> must not exceed the path cost from </w:t>
+      </w:r>
+      <m:oMath>
+        <m:r>
+          <w:rPr>
+            <w:rFonts w:ascii="Cambria Math" w:eastAsiaTheme="minorEastAsia" w:hAnsi="Cambria Math"/>
+          </w:rPr>
+          <m:t>n</m:t>
+        </m:r>
+      </m:oMath>
+      <w:r>
+        <w:rPr>
+          <w:rFonts w:eastAsiaTheme="minorEastAsia"/>
+        </w:rPr>
+        <w:t xml:space="preserve"> to </w:t>
+      </w:r>
+      <m:oMath>
+        <m:r>
+          <w:rPr>
+            <w:rFonts w:ascii="Cambria Math" w:eastAsiaTheme="minorEastAsia" w:hAnsi="Cambria Math"/>
+          </w:rPr>
+          <m:t>n'</m:t>
+        </m:r>
+      </m:oMath>
+      <w:r>
+        <w:rPr>
+          <w:rFonts w:eastAsiaTheme="minorEastAsia"/>
+        </w:rPr>
+        <w:t xml:space="preserve"> and the heuristic cost </w:t>
+      </w:r>
+      <m:oMath>
+        <m:r>
+          <w:rPr>
+            <w:rFonts w:ascii="Cambria Math" w:eastAsiaTheme="minorEastAsia" w:hAnsi="Cambria Math"/>
+          </w:rPr>
+          <m:t>h</m:t>
+        </m:r>
+        <m:d>
+          <m:dPr>
+            <m:ctrlPr>
+              <w:rPr>
+                <w:rFonts w:ascii="Cambria Math" w:eastAsiaTheme="minorEastAsia" w:hAnsi="Cambria Math"/>
+                <w:i/>
+              </w:rPr>
+            </m:ctrlPr>
+          </m:dPr>
+          <m:e>
+            <m:sSup>
+              <m:sSupPr>
+                <m:ctrlPr>
+                  <w:rPr>
+                    <w:rFonts w:ascii="Cambria Math" w:eastAsiaTheme="minorEastAsia" w:hAnsi="Cambria Math"/>
+                    <w:i/>
+                  </w:rPr>
+                </m:ctrlPr>
+              </m:sSupPr>
+              <m:e>
+                <m:r>
+                  <w:rPr>
+                    <w:rFonts w:ascii="Cambria Math" w:eastAsiaTheme="minorEastAsia" w:hAnsi="Cambria Math"/>
+                  </w:rPr>
+                  <m:t>n</m:t>
+                </m:r>
+              </m:e>
+              <m:sup>
+                <m:r>
+                  <w:rPr>
+                    <w:rFonts w:ascii="Cambria Math" w:eastAsiaTheme="minorEastAsia" w:hAnsi="Cambria Math"/>
+                  </w:rPr>
+                  <m:t>'</m:t>
+                </m:r>
+              </m:sup>
+            </m:sSup>
+          </m:e>
+        </m:d>
+      </m:oMath>
+      <w:r>
+        <w:rPr>
+          <w:rFonts w:eastAsiaTheme="minorEastAsia"/>
+        </w:rPr>
+        <w:t>.</w:t>
+      </w:r>
+      <w:r>
+        <w:rPr>
+          <w:rFonts w:eastAsiaTheme="minorEastAsia"/>
+        </w:rPr>
+        <w:t xml:space="preserve"> That is, </w:t>
+      </w:r>
+      <m:oMath>
+        <m:r>
+          <w:rPr>
+            <w:rFonts w:ascii="Cambria Math" w:eastAsiaTheme="minorEastAsia" w:hAnsi="Cambria Math"/>
+          </w:rPr>
+          <m:t>∀</m:t>
+        </m:r>
+        <m:r>
+          <w:rPr>
+            <w:rFonts w:ascii="Cambria Math" w:eastAsiaTheme="minorEastAsia" w:hAnsi="Cambria Math"/>
+          </w:rPr>
+          <m:t xml:space="preserve"> n,</m:t>
+        </m:r>
+        <m:r>
+          <w:rPr>
+            <w:rFonts w:ascii="Cambria Math" w:eastAsiaTheme="minorEastAsia" w:hAnsi="Cambria Math"/>
+          </w:rPr>
+          <m:t>∀</m:t>
+        </m:r>
+        <m:r>
+          <w:rPr>
+            <w:rFonts w:ascii="Cambria Math" w:eastAsiaTheme="minorEastAsia" w:hAnsi="Cambria Math"/>
+          </w:rPr>
+          <m:t xml:space="preserve"> </m:t>
+        </m:r>
+        <m:sSup>
+          <m:sSupPr>
+            <m:ctrlPr>
+              <w:rPr>
+                <w:rFonts w:ascii="Cambria Math" w:eastAsiaTheme="minorEastAsia" w:hAnsi="Cambria Math"/>
+                <w:i/>
+              </w:rPr>
+            </m:ctrlPr>
+          </m:sSupPr>
+          <m:e>
+            <m:r>
+              <w:rPr>
+                <w:rFonts w:ascii="Cambria Math" w:eastAsiaTheme="minorEastAsia" w:hAnsi="Cambria Math"/>
+              </w:rPr>
+              <m:t>n</m:t>
+            </m:r>
+          </m:e>
+          <m:sup>
+            <m:r>
+              <w:rPr>
+                <w:rFonts w:ascii="Cambria Math" w:eastAsiaTheme="minorEastAsia" w:hAnsi="Cambria Math"/>
+              </w:rPr>
+              <m:t>'</m:t>
+            </m:r>
+          </m:sup>
+        </m:sSup>
+        <m:r>
+          <w:rPr>
+            <w:rFonts w:ascii="Cambria Math" w:eastAsiaTheme="minorEastAsia" w:hAnsi="Cambria Math"/>
+          </w:rPr>
+          <m:t xml:space="preserve"> </m:t>
+        </m:r>
+        <m:r>
+          <m:rPr>
+            <m:sty m:val="p"/>
+          </m:rPr>
+          <w:rPr>
+            <w:rFonts w:ascii="Cambria Math" w:eastAsiaTheme="minorEastAsia" w:hAnsi="Cambria Math"/>
+          </w:rPr>
+          <m:t>successor of n</m:t>
+        </m:r>
+        <m:r>
+          <w:rPr>
+            <w:rFonts w:ascii="Cambria Math" w:eastAsiaTheme="minorEastAsia" w:hAnsi="Cambria Math"/>
+          </w:rPr>
+          <m:t>: h</m:t>
+        </m:r>
+        <m:d>
+          <m:dPr>
+            <m:ctrlPr>
+              <w:rPr>
+                <w:rFonts w:ascii="Cambria Math" w:eastAsiaTheme="minorEastAsia" w:hAnsi="Cambria Math"/>
+                <w:i/>
+              </w:rPr>
+            </m:ctrlPr>
+          </m:dPr>
+          <m:e>
+            <m:r>
+              <w:rPr>
+                <w:rFonts w:ascii="Cambria Math" w:eastAsiaTheme="minorEastAsia" w:hAnsi="Cambria Math"/>
+              </w:rPr>
+              <m:t>n</m:t>
+            </m:r>
+          </m:e>
+        </m:d>
+        <m:r>
+          <w:rPr>
+            <w:rFonts w:ascii="Cambria Math" w:eastAsiaTheme="minorEastAsia" w:hAnsi="Cambria Math"/>
+          </w:rPr>
+          <m:t>≤</m:t>
+        </m:r>
+        <m:r>
+          <w:rPr>
+            <w:rFonts w:ascii="Cambria Math" w:eastAsiaTheme="minorEastAsia" w:hAnsi="Cambria Math"/>
+          </w:rPr>
+          <m:t xml:space="preserve"> c(n,n') + h(n')</m:t>
+        </m:r>
+      </m:oMath>
+      <w:r>
+        <w:rPr>
+          <w:rFonts w:eastAsiaTheme="minorEastAsia"/>
+        </w:rPr>
+        <w:t>.</w:t>
+      </w:r>
+    </w:p>
+    <w:p>
+      <w:r>
+        <w:t xml:space="preserve">To show consistency, consider moving from </w:t>
+      </w:r>
+      <m:oMath>
+        <m:r>
+          <w:rPr>
+            <w:rFonts w:ascii="Cambria Math" w:hAnsi="Cambria Math"/>
+          </w:rPr>
+          <m:t>n</m:t>
+        </m:r>
+      </m:oMath>
+      <w:r>
+        <w:rPr>
+          <w:rFonts w:eastAsiaTheme="minorEastAsia"/>
+        </w:rPr>
+        <w:t xml:space="preserve"> to a neighbour </w:t>
+      </w:r>
+      <m:oMath>
+        <m:r>
+          <w:rPr>
+            <w:rFonts w:ascii="Cambria Math" w:eastAsiaTheme="minorEastAsia" w:hAnsi="Cambria Math"/>
+          </w:rPr>
+          <m:t>n'</m:t>
+        </m:r>
+      </m:oMath>
+      <w:r>
+        <w:rPr>
+          <w:rFonts w:eastAsiaTheme="minorEastAsia"/>
+        </w:rPr>
+        <w:t xml:space="preserve">, </w:t>
+      </w:r>
+      <w:r>
+        <w:rPr>
+          <w:rFonts w:eastAsiaTheme="minorEastAsia"/>
+        </w:rPr>
+        <w:t>the Manhattan heuristic guarantees</w:t>
+      </w:r>
+      <w:r>
+        <w:rPr>
+          <w:rFonts w:eastAsiaTheme="minorEastAsia"/>
+        </w:rPr>
+        <w:t xml:space="preserve"> </w:t>
+      </w:r>
+      <m:oMath>
+        <m:d>
+          <m:dPr>
+            <m:begChr m:val="|"/>
+            <m:endChr m:val="|"/>
+            <m:ctrlPr>
+              <w:rPr>
+                <w:rFonts w:ascii="Cambria Math" w:eastAsiaTheme="minorEastAsia" w:hAnsi="Cambria Math"/>
+                <w:i/>
+              </w:rPr>
+            </m:ctrlPr>
+          </m:dPr>
+          <m:e>
+            <m:r>
+              <w:rPr>
+                <w:rFonts w:ascii="Cambria Math" w:eastAsiaTheme="minorEastAsia" w:hAnsi="Cambria Math"/>
+              </w:rPr>
+              <m:t>h</m:t>
+            </m:r>
+            <m:d>
+              <m:dPr>
+                <m:ctrlPr>
+                  <w:rPr>
+                    <w:rFonts w:ascii="Cambria Math" w:eastAsiaTheme="minorEastAsia" w:hAnsi="Cambria Math"/>
+                    <w:i/>
+                  </w:rPr>
+                </m:ctrlPr>
+              </m:dPr>
+              <m:e>
+                <m:r>
+                  <w:rPr>
+                    <w:rFonts w:ascii="Cambria Math" w:eastAsiaTheme="minorEastAsia" w:hAnsi="Cambria Math"/>
+                  </w:rPr>
+                  <m:t>n</m:t>
+                </m:r>
+              </m:e>
+            </m:d>
+            <m:r>
+              <w:rPr>
+                <w:rFonts w:ascii="Cambria Math" w:eastAsiaTheme="minorEastAsia" w:hAnsi="Cambria Math"/>
+              </w:rPr>
+              <m:t>-h</m:t>
+            </m:r>
+            <m:d>
+              <m:dPr>
+                <m:ctrlPr>
+                  <w:rPr>
+                    <w:rFonts w:ascii="Cambria Math" w:eastAsiaTheme="minorEastAsia" w:hAnsi="Cambria Math"/>
+                    <w:i/>
+                  </w:rPr>
+                </m:ctrlPr>
+              </m:dPr>
+              <m:e>
+                <m:sSup>
+                  <m:sSupPr>
+                    <m:ctrlPr>
+                      <w:rPr>
+                        <w:rFonts w:ascii="Cambria Math" w:eastAsiaTheme="minorEastAsia" w:hAnsi="Cambria Math"/>
+                        <w:i/>
+                      </w:rPr>
+                    </m:ctrlPr>
+                  </m:sSupPr>
+                  <m:e>
+                    <m:r>
+                      <w:rPr>
+                        <w:rFonts w:ascii="Cambria Math" w:eastAsiaTheme="minorEastAsia" w:hAnsi="Cambria Math"/>
+                      </w:rPr>
+                      <m:t>n</m:t>
+                    </m:r>
+                  </m:e>
+                  <m:sup>
+                    <m:r>
+                      <w:rPr>
+                        <w:rFonts w:ascii="Cambria Math" w:eastAsiaTheme="minorEastAsia" w:hAnsi="Cambria Math"/>
+                      </w:rPr>
+                      <m:t>'</m:t>
+                    </m:r>
+                  </m:sup>
+                </m:sSup>
+              </m:e>
+            </m:d>
+          </m:e>
+        </m:d>
+        <m:r>
+          <w:rPr>
+            <w:rFonts w:ascii="Cambria Math" w:eastAsiaTheme="minorEastAsia" w:hAnsi="Cambria Math"/>
+          </w:rPr>
+          <m:t>≤1</m:t>
+        </m:r>
+      </m:oMath>
+      <w:r>
+        <w:rPr>
+          <w:rFonts w:eastAsiaTheme="minorEastAsia"/>
+        </w:rPr>
+        <w:t>.</w:t>
+      </w:r>
+      <w:r>
+        <w:rPr>
+          <w:rFonts w:eastAsiaTheme="minorEastAsia"/>
+        </w:rPr>
+        <w:t xml:space="preserve"> </w:t>
+      </w:r>
+      <w:r>
+        <w:rPr>
+          <w:rFonts w:eastAsiaTheme="minorEastAsia"/>
+        </w:rPr>
+        <w:t>This can be rewritten as</w:t>
+      </w:r>
+      <w:r>
+        <w:rPr>
+          <w:rFonts w:eastAsiaTheme="minorEastAsia"/>
+        </w:rPr>
+        <w:t xml:space="preserve"> </w:t>
+      </w:r>
+      <m:oMath>
+        <m:r>
+          <w:rPr>
+            <w:rFonts w:ascii="Cambria Math" w:eastAsiaTheme="minorEastAsia" w:hAnsi="Cambria Math"/>
+          </w:rPr>
+          <m:t>h</m:t>
+        </m:r>
+        <m:d>
+          <m:dPr>
+            <m:ctrlPr>
+              <w:rPr>
+                <w:rFonts w:ascii="Cambria Math" w:eastAsiaTheme="minorEastAsia" w:hAnsi="Cambria Math"/>
+                <w:i/>
+              </w:rPr>
+            </m:ctrlPr>
+          </m:dPr>
+          <m:e>
+            <m:r>
+              <w:rPr>
+                <w:rFonts w:ascii="Cambria Math" w:eastAsiaTheme="minorEastAsia" w:hAnsi="Cambria Math"/>
+              </w:rPr>
+              <m:t>n</m:t>
+            </m:r>
+          </m:e>
+        </m:d>
+        <m:r>
+          <w:rPr>
+            <w:rFonts w:ascii="Cambria Math" w:eastAsiaTheme="minorEastAsia" w:hAnsi="Cambria Math"/>
+          </w:rPr>
+          <m:t>≤1+h</m:t>
+        </m:r>
+        <m:d>
+          <m:dPr>
+            <m:ctrlPr>
+              <w:rPr>
+                <w:rFonts w:ascii="Cambria Math" w:eastAsiaTheme="minorEastAsia" w:hAnsi="Cambria Math"/>
+                <w:i/>
+              </w:rPr>
+            </m:ctrlPr>
+          </m:dPr>
+          <m:e>
+            <m:sSup>
+              <m:sSupPr>
+                <m:ctrlPr>
+                  <w:rPr>
+                    <w:rFonts w:ascii="Cambria Math" w:eastAsiaTheme="minorEastAsia" w:hAnsi="Cambria Math"/>
+                    <w:i/>
+                  </w:rPr>
+                </m:ctrlPr>
+              </m:sSupPr>
+              <m:e>
+                <m:r>
+                  <w:rPr>
+                    <w:rFonts w:ascii="Cambria Math" w:eastAsiaTheme="minorEastAsia" w:hAnsi="Cambria Math"/>
+                  </w:rPr>
+                  <m:t>n</m:t>
+                </m:r>
+              </m:e>
+              <m:sup>
+                <m:r>
+                  <w:rPr>
+                    <w:rFonts w:ascii="Cambria Math" w:eastAsiaTheme="minorEastAsia" w:hAnsi="Cambria Math"/>
+                  </w:rPr>
+                  <m:t>'</m:t>
+                </m:r>
+              </m:sup>
+            </m:sSup>
+          </m:e>
+        </m:d>
+        <m:r>
+          <w:rPr>
+            <w:rFonts w:ascii="Cambria Math" w:eastAsiaTheme="minorEastAsia" w:hAnsi="Cambria Math"/>
+          </w:rPr>
+          <m:t>=c</m:t>
+        </m:r>
+        <m:d>
+          <m:dPr>
+            <m:ctrlPr>
+              <w:rPr>
+                <w:rFonts w:ascii="Cambria Math" w:eastAsiaTheme="minorEastAsia" w:hAnsi="Cambria Math"/>
+                <w:i/>
+              </w:rPr>
+            </m:ctrlPr>
+          </m:dPr>
+          <m:e>
+            <m:r>
+              <w:rPr>
+                <w:rFonts w:ascii="Cambria Math" w:eastAsiaTheme="minorEastAsia" w:hAnsi="Cambria Math"/>
+              </w:rPr>
+              <m:t>n,</m:t>
+            </m:r>
+            <m:sSup>
+              <m:sSupPr>
+                <m:ctrlPr>
+                  <w:rPr>
+                    <w:rFonts w:ascii="Cambria Math" w:eastAsiaTheme="minorEastAsia" w:hAnsi="Cambria Math"/>
+                    <w:i/>
+                  </w:rPr>
+                </m:ctrlPr>
+              </m:sSupPr>
+              <m:e>
+                <m:r>
+                  <w:rPr>
+                    <w:rFonts w:ascii="Cambria Math" w:eastAsiaTheme="minorEastAsia" w:hAnsi="Cambria Math"/>
+                  </w:rPr>
+                  <m:t>n</m:t>
+                </m:r>
+              </m:e>
+              <m:sup>
+                <m:r>
+                  <w:rPr>
+                    <w:rFonts w:ascii="Cambria Math" w:eastAsiaTheme="minorEastAsia" w:hAnsi="Cambria Math"/>
+                  </w:rPr>
+                  <m:t>'</m:t>
+                </m:r>
+              </m:sup>
+            </m:sSup>
+          </m:e>
+        </m:d>
+        <m:r>
+          <w:rPr>
+            <w:rFonts w:ascii="Cambria Math" w:eastAsiaTheme="minorEastAsia" w:hAnsi="Cambria Math"/>
+          </w:rPr>
+          <m:t>+h(</m:t>
+        </m:r>
+        <m:sSup>
+          <m:sSupPr>
+            <m:ctrlPr>
+              <w:rPr>
+                <w:rFonts w:ascii="Cambria Math" w:eastAsiaTheme="minorEastAsia" w:hAnsi="Cambria Math"/>
+                <w:i/>
+              </w:rPr>
+            </m:ctrlPr>
+          </m:sSupPr>
+          <m:e>
+            <m:r>
+              <w:rPr>
+                <w:rFonts w:ascii="Cambria Math" w:eastAsiaTheme="minorEastAsia" w:hAnsi="Cambria Math"/>
+              </w:rPr>
+              <m:t>n</m:t>
+            </m:r>
+          </m:e>
+          <m:sup>
+            <m:r>
+              <w:rPr>
+                <w:rFonts w:ascii="Cambria Math" w:eastAsiaTheme="minorEastAsia" w:hAnsi="Cambria Math"/>
+              </w:rPr>
+              <m:t>'</m:t>
+            </m:r>
+          </m:sup>
+        </m:sSup>
+        <m:r>
+          <w:rPr>
+            <w:rFonts w:ascii="Cambria Math" w:eastAsiaTheme="minorEastAsia" w:hAnsi="Cambria Math"/>
+          </w:rPr>
+          <m:t>)</m:t>
+        </m:r>
+      </m:oMath>
+      <w:r>
+        <w:rPr>
+          <w:rFonts w:eastAsiaTheme="minorEastAsia"/>
+        </w:rPr>
+        <w:t>, therefore satisfying the</w:t>
+      </w:r>
+      <w:r>
+        <w:rPr>
+          <w:rFonts w:eastAsiaTheme="minorEastAsia"/>
+        </w:rPr>
+        <w:t xml:space="preserve"> requirements</w:t>
+      </w:r>
+      <w:r>
+        <w:rPr>
+          <w:rFonts w:eastAsiaTheme="minorEastAsia"/>
+        </w:rPr>
+        <w:t xml:space="preserve"> for consistency</w:t>
+      </w:r>
+      <w:r>
+        <w:rPr>
+          <w:rFonts w:eastAsiaTheme="minorEastAsia"/>
+        </w:rPr>
+        <w:t>.</w:t>
       </w:r>
     </w:p>
     <w:p/>
     <w:p/>
+    <w:p/>
+    <w:p>
+      <w:pPr>
+        <w:rPr>
+          <w:rFonts w:eastAsiaTheme="minorEastAsia"/>
+        </w:rPr>
+      </w:pPr>
+      <w:r>
+        <w:t>For a heuristic</w:t>
+      </w:r>
+      <w:r>
+        <w:t xml:space="preserve"> </w:t>
+      </w:r>
+      <m:oMath>
+        <m:r>
+          <w:rPr>
+            <w:rFonts w:ascii="Cambria Math" w:hAnsi="Cambria Math"/>
+          </w:rPr>
+          <m:t>h</m:t>
+        </m:r>
+        <m:d>
+          <m:dPr>
+            <m:ctrlPr>
+              <w:rPr>
+                <w:rFonts w:ascii="Cambria Math" w:hAnsi="Cambria Math"/>
+                <w:i/>
+              </w:rPr>
+            </m:ctrlPr>
+          </m:dPr>
+          <m:e>
+            <m:r>
+              <w:rPr>
+                <w:rFonts w:ascii="Cambria Math" w:hAnsi="Cambria Math"/>
+              </w:rPr>
+              <m:t>n</m:t>
+            </m:r>
+          </m:e>
+        </m:d>
+      </m:oMath>
+      <w:r>
+        <w:t xml:space="preserve"> to be admissible, </w:t>
+      </w:r>
+      <w:r>
+        <w:t xml:space="preserve">for all nodes </w:t>
+      </w:r>
+      <m:oMath>
+        <m:r>
+          <w:rPr>
+            <w:rFonts w:ascii="Cambria Math" w:hAnsi="Cambria Math"/>
+          </w:rPr>
+          <m:t>n</m:t>
+        </m:r>
+      </m:oMath>
+      <w:r>
+        <w:rPr>
+          <w:rFonts w:eastAsiaTheme="minorEastAsia"/>
+        </w:rPr>
+        <w:t xml:space="preserve">, </w:t>
+      </w:r>
+      <m:oMath>
+        <m:r>
+          <w:rPr>
+            <w:rFonts w:ascii="Cambria Math" w:eastAsiaTheme="minorEastAsia" w:hAnsi="Cambria Math"/>
+          </w:rPr>
+          <m:t>h(n)</m:t>
+        </m:r>
+      </m:oMath>
+      <w:r>
+        <w:rPr>
+          <w:rFonts w:eastAsiaTheme="minorEastAsia"/>
+        </w:rPr>
+        <w:t xml:space="preserve"> must not overestimate the true cost to the goal</w:t>
+      </w:r>
+      <w:r>
+        <w:rPr>
+          <w:rFonts w:eastAsiaTheme="minorEastAsia"/>
+        </w:rPr>
+        <w:t>. (</w:t>
+      </w:r>
+      <m:oMath>
+        <m:r>
+          <w:rPr>
+            <w:rFonts w:ascii="Cambria Math" w:hAnsi="Cambria Math"/>
+          </w:rPr>
+          <m:t>∀</m:t>
+        </m:r>
+        <m:r>
+          <w:rPr>
+            <w:rFonts w:ascii="Cambria Math" w:hAnsi="Cambria Math"/>
+          </w:rPr>
+          <m:t xml:space="preserve"> n: h</m:t>
+        </m:r>
+        <m:d>
+          <m:dPr>
+            <m:ctrlPr>
+              <w:rPr>
+                <w:rFonts w:ascii="Cambria Math" w:hAnsi="Cambria Math"/>
+                <w:i/>
+              </w:rPr>
+            </m:ctrlPr>
+          </m:dPr>
+          <m:e>
+            <m:r>
+              <w:rPr>
+                <w:rFonts w:ascii="Cambria Math" w:hAnsi="Cambria Math"/>
+              </w:rPr>
+              <m:t>n</m:t>
+            </m:r>
+          </m:e>
+        </m:d>
+        <m:r>
+          <w:rPr>
+            <w:rFonts w:ascii="Cambria Math" w:hAnsi="Cambria Math"/>
+          </w:rPr>
+          <m:t>≤</m:t>
+        </m:r>
+        <m:r>
+          <w:rPr>
+            <w:rFonts w:ascii="Cambria Math" w:hAnsi="Cambria Math"/>
+          </w:rPr>
+          <m:t xml:space="preserve"> </m:t>
+        </m:r>
+        <m:sSup>
+          <m:sSupPr>
+            <m:ctrlPr>
+              <w:rPr>
+                <w:rFonts w:ascii="Cambria Math" w:hAnsi="Cambria Math"/>
+                <w:i/>
+              </w:rPr>
+            </m:ctrlPr>
+          </m:sSupPr>
+          <m:e>
+            <m:r>
+              <w:rPr>
+                <w:rFonts w:ascii="Cambria Math" w:hAnsi="Cambria Math"/>
+              </w:rPr>
+              <m:t>h</m:t>
+            </m:r>
+          </m:e>
+          <m:sup>
+            <m:r>
+              <w:rPr>
+                <w:rFonts w:ascii="Cambria Math" w:hAnsi="Cambria Math"/>
+              </w:rPr>
+              <m:t>*</m:t>
+            </m:r>
+          </m:sup>
+        </m:sSup>
+        <m:d>
+          <m:dPr>
+            <m:ctrlPr>
+              <w:rPr>
+                <w:rFonts w:ascii="Cambria Math" w:hAnsi="Cambria Math"/>
+                <w:i/>
+              </w:rPr>
+            </m:ctrlPr>
+          </m:dPr>
+          <m:e>
+            <m:r>
+              <w:rPr>
+                <w:rFonts w:ascii="Cambria Math" w:hAnsi="Cambria Math"/>
+              </w:rPr>
+              <m:t>n</m:t>
+            </m:r>
+          </m:e>
+        </m:d>
+      </m:oMath>
+      <w:r>
+        <w:rPr>
+          <w:rFonts w:eastAsiaTheme="minorEastAsia"/>
+        </w:rPr>
+        <w:t>)</w:t>
+      </w:r>
+      <w:r>
+        <w:rPr>
+          <w:rFonts w:eastAsiaTheme="minorEastAsia"/>
+        </w:rPr>
+        <w:t>.</w:t>
+      </w:r>
+    </w:p>
+    <w:p>
+      <w:pPr>
+        <w:rPr>
+          <w:rFonts w:eastAsiaTheme="minorEastAsia"/>
+        </w:rPr>
+      </w:pPr>
+    </w:p>
+    <w:p>
+      <w:pPr>
+        <w:rPr>
+          <w:rFonts w:eastAsiaTheme="minorEastAsia"/>
+        </w:rPr>
+      </w:pPr>
+    </w:p>
+    <w:p>
+      <w:pPr>
+        <w:rPr>
+          <w:rFonts w:eastAsiaTheme="minorEastAsia"/>
+        </w:rPr>
+      </w:pPr>
+    </w:p>
+    <w:p>
+      <w:pPr>
+        <w:rPr>
+          <w:rFonts w:eastAsiaTheme="minorEastAsia"/>
+        </w:rPr>
+      </w:pPr>
+    </w:p>
+    <w:p>
+      <w:pPr>
+        <w:rPr>
+          <w:rFonts w:eastAsiaTheme="minorEastAsia"/>
+        </w:rPr>
+      </w:pPr>
+      <w:r>
+        <w:rPr>
+          <w:rFonts w:eastAsiaTheme="minorEastAsia"/>
+        </w:rPr>
+        <w:t xml:space="preserve"> To prove that the Manhattan heuristic is admissible, we may employ a proof by contradiction.</w:t>
+      </w:r>
+    </w:p>
+    <w:p>
+      <w:pPr>
+        <w:rPr>
+          <w:rFonts w:eastAsiaTheme="minorEastAsia"/>
+        </w:rPr>
+      </w:pPr>
+      <w:r>
+        <w:rPr>
+          <w:rFonts w:eastAsiaTheme="minorEastAsia"/>
+        </w:rPr>
+        <w:t xml:space="preserve">Assume that </w:t>
+      </w:r>
+      <m:oMath>
+        <m:r>
+          <w:rPr>
+            <w:rFonts w:ascii="Cambria Math" w:eastAsiaTheme="minorEastAsia" w:hAnsi="Cambria Math"/>
+          </w:rPr>
+          <m:t>h</m:t>
+        </m:r>
+      </m:oMath>
+      <w:r>
+        <w:rPr>
+          <w:rFonts w:eastAsiaTheme="minorEastAsia"/>
+        </w:rPr>
+        <w:t xml:space="preserve"> is not admissible, that is:</w:t>
+      </w:r>
+    </w:p>
+    <w:p>
+      <w:pPr>
+        <w:rPr>
+          <w:rFonts w:eastAsiaTheme="minorEastAsia"/>
+        </w:rPr>
+      </w:pPr>
+      <m:oMathPara>
+        <m:oMath>
+          <m:r>
+            <w:rPr>
+              <w:rFonts w:ascii="Cambria Math" w:eastAsiaTheme="minorEastAsia" w:hAnsi="Cambria Math"/>
+            </w:rPr>
+            <m:t>h</m:t>
+          </m:r>
+          <m:d>
+            <m:dPr>
+              <m:ctrlPr>
+                <w:rPr>
+                  <w:rFonts w:ascii="Cambria Math" w:eastAsiaTheme="minorEastAsia" w:hAnsi="Cambria Math"/>
+                  <w:i/>
+                </w:rPr>
+              </m:ctrlPr>
+            </m:dPr>
+            <m:e>
+              <m:r>
+                <w:rPr>
+                  <w:rFonts w:ascii="Cambria Math" w:eastAsiaTheme="minorEastAsia" w:hAnsi="Cambria Math"/>
+                </w:rPr>
+                <m:t>n</m:t>
+              </m:r>
+            </m:e>
+          </m:d>
+          <m:r>
+            <w:rPr>
+              <w:rFonts w:ascii="Cambria Math" w:eastAsiaTheme="minorEastAsia" w:hAnsi="Cambria Math"/>
+            </w:rPr>
+            <m:t>&gt;</m:t>
+          </m:r>
+          <m:sSup>
+            <m:sSupPr>
+              <m:ctrlPr>
+                <w:rPr>
+                  <w:rFonts w:ascii="Cambria Math" w:eastAsiaTheme="minorEastAsia" w:hAnsi="Cambria Math"/>
+                  <w:i/>
+                </w:rPr>
+              </m:ctrlPr>
+            </m:sSupPr>
+            <m:e>
+              <m:r>
+                <w:rPr>
+                  <w:rFonts w:ascii="Cambria Math" w:eastAsiaTheme="minorEastAsia" w:hAnsi="Cambria Math"/>
+                </w:rPr>
+                <m:t>h</m:t>
+              </m:r>
+            </m:e>
+            <m:sup>
+              <m:r>
+                <w:rPr>
+                  <w:rFonts w:ascii="Cambria Math" w:eastAsiaTheme="minorEastAsia" w:hAnsi="Cambria Math"/>
+                </w:rPr>
+                <m:t>*</m:t>
+              </m:r>
+            </m:sup>
+          </m:sSup>
+          <m:r>
+            <w:rPr>
+              <w:rFonts w:ascii="Cambria Math" w:eastAsiaTheme="minorEastAsia" w:hAnsi="Cambria Math"/>
+            </w:rPr>
+            <m:t>(n)</m:t>
+          </m:r>
+        </m:oMath>
+      </m:oMathPara>
+    </w:p>
+    <w:p>
+      <w:pPr>
+        <w:rPr>
+          <w:rFonts w:eastAsiaTheme="minorEastAsia"/>
+        </w:rPr>
+      </w:pPr>
+      <w:r>
+        <w:rPr>
+          <w:rFonts w:eastAsiaTheme="minorEastAsia"/>
+        </w:rPr>
+        <w:t xml:space="preserve">where </w:t>
+      </w:r>
+      <m:oMath>
+        <m:sSup>
+          <m:sSupPr>
+            <m:ctrlPr>
+              <w:rPr>
+                <w:rFonts w:ascii="Cambria Math" w:eastAsiaTheme="minorEastAsia" w:hAnsi="Cambria Math"/>
+                <w:i/>
+              </w:rPr>
+            </m:ctrlPr>
+          </m:sSupPr>
+          <m:e>
+            <m:r>
+              <w:rPr>
+                <w:rFonts w:ascii="Cambria Math" w:eastAsiaTheme="minorEastAsia" w:hAnsi="Cambria Math"/>
+              </w:rPr>
+              <m:t>h</m:t>
+            </m:r>
+          </m:e>
+          <m:sup>
+            <m:r>
+              <w:rPr>
+                <w:rFonts w:ascii="Cambria Math" w:eastAsiaTheme="minorEastAsia" w:hAnsi="Cambria Math"/>
+              </w:rPr>
+              <m:t>*</m:t>
+            </m:r>
+          </m:sup>
+        </m:sSup>
+        <m:r>
+          <w:rPr>
+            <w:rFonts w:ascii="Cambria Math" w:eastAsiaTheme="minorEastAsia" w:hAnsi="Cambria Math"/>
+          </w:rPr>
+          <m:t>(n)</m:t>
+        </m:r>
+      </m:oMath>
+      <w:r>
+        <w:rPr>
+          <w:rFonts w:eastAsiaTheme="minorEastAsia"/>
+        </w:rPr>
+        <w:t xml:space="preserve"> is the optimal path length from </w:t>
+      </w:r>
+      <m:oMath>
+        <m:r>
+          <w:rPr>
+            <w:rFonts w:ascii="Cambria Math" w:eastAsiaTheme="minorEastAsia" w:hAnsi="Cambria Math"/>
+          </w:rPr>
+          <m:t>n</m:t>
+        </m:r>
+      </m:oMath>
+      <w:r>
+        <w:rPr>
+          <w:rFonts w:eastAsiaTheme="minorEastAsia"/>
+        </w:rPr>
+        <w:t xml:space="preserve"> to the goal.</w:t>
+      </w:r>
+    </w:p>
     <w:p>
       <w:pPr>
         <w:pStyle w:val="Heading3"/>
@@ -2492,7 +3699,7 @@
   <w:style w:type="paragraph" w:default="1" w:styleId="Normal">
     <w:name w:val="Normal"/>
     <w:qFormat/>
-    <w:rsid w:val="00DD0C93"/>
+    <w:rsid w:val="007B651F"/>
     <w:rPr>
       <w:rFonts w:ascii="Arial" w:hAnsi="Arial" w:cs="Arial"/>
     </w:rPr>

</xml_diff>

<commit_message>
worked on cnn section on report
</commit_message>
<xml_diff>
--- a/2802ict-assignments/assignment_01/Report.docx
+++ b/2802ict-assignments/assignment_01/Report.docx
@@ -1257,7 +1257,15 @@
           </w:tcPr>
           <w:p>
             <w:r>
-              <w:t xml:space="preserve">A Python dataclass </w:t>
+              <w:t xml:space="preserve">A Python </w:t>
+            </w:r>
+            <w:proofErr w:type="spellStart"/>
+            <w:r>
+              <w:t>dataclass</w:t>
+            </w:r>
+            <w:proofErr w:type="spellEnd"/>
+            <w:r>
+              <w:t xml:space="preserve"> </w:t>
             </w:r>
             <w:r>
               <w:t xml:space="preserve">storing </w:t>
@@ -1281,6 +1289,7 @@
                 <w:bCs/>
               </w:rPr>
             </w:pPr>
+            <w:proofErr w:type="spellStart"/>
             <w:r>
               <w:rPr>
                 <w:rFonts w:ascii="Consolas" w:hAnsi="Consolas"/>
@@ -1291,6 +1300,7 @@
               </w:rPr>
               <w:t>FrontierADT</w:t>
             </w:r>
+            <w:proofErr w:type="spellEnd"/>
           </w:p>
         </w:tc>
         <w:tc>
@@ -1317,6 +1327,7 @@
                 <w:bCs/>
               </w:rPr>
             </w:pPr>
+            <w:proofErr w:type="spellStart"/>
             <w:r>
               <w:rPr>
                 <w:rFonts w:ascii="Consolas" w:hAnsi="Consolas"/>
@@ -1327,6 +1338,7 @@
               </w:rPr>
               <w:t>StackFrontier</w:t>
             </w:r>
+            <w:proofErr w:type="spellEnd"/>
           </w:p>
         </w:tc>
         <w:tc>
@@ -1337,12 +1349,14 @@
             <w:r>
               <w:t xml:space="preserve">A </w:t>
             </w:r>
+            <w:proofErr w:type="spellStart"/>
             <w:r>
               <w:rPr>
                 <w:rStyle w:val="TextttChar"/>
               </w:rPr>
               <w:t>FrontierADT</w:t>
             </w:r>
+            <w:proofErr w:type="spellEnd"/>
             <w:r>
               <w:t xml:space="preserve"> implementation leveraging a last-in-last-out stack for use in the depth-limited depth-first search method.</w:t>
             </w:r>
@@ -1362,6 +1376,7 @@
                 <w:bCs/>
               </w:rPr>
             </w:pPr>
+            <w:proofErr w:type="spellStart"/>
             <w:r>
               <w:rPr>
                 <w:rFonts w:ascii="Consolas" w:hAnsi="Consolas"/>
@@ -1372,6 +1387,7 @@
               </w:rPr>
               <w:t>PriorityQueueFrontier</w:t>
             </w:r>
+            <w:proofErr w:type="spellEnd"/>
           </w:p>
         </w:tc>
         <w:tc>
@@ -1382,18 +1398,22 @@
             <w:r>
               <w:t xml:space="preserve">A </w:t>
             </w:r>
+            <w:proofErr w:type="spellStart"/>
             <w:r>
               <w:rPr>
                 <w:rStyle w:val="TextttChar"/>
               </w:rPr>
               <w:t>FrontierADT</w:t>
             </w:r>
+            <w:proofErr w:type="spellEnd"/>
             <w:r>
               <w:t xml:space="preserve"> implementation leveraging a priority-heap for use in the A* search method. On construction it accepts a method </w:t>
             </w:r>
+            <w:proofErr w:type="spellStart"/>
             <w:r>
               <w:t>cost_fn</w:t>
             </w:r>
+            <w:proofErr w:type="spellEnd"/>
             <w:r>
               <w:t xml:space="preserve"> to compute node cost.</w:t>
             </w:r>
@@ -1465,6 +1485,7 @@
       <w:r>
         <w:t xml:space="preserve">mplemented as the </w:t>
       </w:r>
+      <w:proofErr w:type="spellStart"/>
       <w:r>
         <w:rPr>
           <w:rStyle w:val="TextttChar"/>
@@ -1477,6 +1498,7 @@
         </w:rPr>
         <w:t>dfs_solve</w:t>
       </w:r>
+      <w:proofErr w:type="spellEnd"/>
       <w:r>
         <w:rPr>
           <w:sz w:val="20"/>
@@ -1508,12 +1530,14 @@
       <w:r>
         <w:t xml:space="preserve">leveraging the </w:t>
       </w:r>
+      <w:proofErr w:type="spellStart"/>
       <w:r>
         <w:rPr>
           <w:rStyle w:val="TextttChar"/>
         </w:rPr>
         <w:t>StackFrontier</w:t>
       </w:r>
+      <w:proofErr w:type="spellEnd"/>
       <w:r>
         <w:t xml:space="preserve"> class.</w:t>
       </w:r>
@@ -1523,12 +1547,14 @@
       <w:r>
         <w:t xml:space="preserve">On failure to find the goal node the method will raise </w:t>
       </w:r>
+      <w:proofErr w:type="spellStart"/>
       <w:r>
         <w:rPr>
           <w:rStyle w:val="TextttChar"/>
         </w:rPr>
         <w:t>DepthLimitReachedError</w:t>
       </w:r>
+      <w:proofErr w:type="spellEnd"/>
       <w:r>
         <w:rPr>
           <w:sz w:val="18"/>
@@ -1565,12 +1591,14 @@
       <w:r>
         <w:t xml:space="preserve">The method is complete provided the goal depth exceeds the </w:t>
       </w:r>
+      <w:proofErr w:type="spellStart"/>
       <w:r>
         <w:rPr>
           <w:rStyle w:val="TextttChar"/>
         </w:rPr>
         <w:t>max_depth</w:t>
       </w:r>
+      <w:proofErr w:type="spellEnd"/>
       <w:r>
         <w:t xml:space="preserve"> argument </w:t>
       </w:r>
@@ -1586,12 +1614,14 @@
       <w:r>
         <w:t xml:space="preserve">A starting node is defined with the starting state, no parent, no action and a depth of 0. A </w:t>
       </w:r>
+      <w:proofErr w:type="spellStart"/>
       <w:r>
         <w:rPr>
           <w:rStyle w:val="TextttChar"/>
         </w:rPr>
         <w:t>StackFrontier</w:t>
       </w:r>
+      <w:proofErr w:type="spellEnd"/>
       <w:r>
         <w:t xml:space="preserve"> is</w:t>
       </w:r>
@@ -1605,8 +1635,13 @@
         <w:t xml:space="preserve"> </w:t>
       </w:r>
       <w:r>
-        <w:t>An explored set is defined</w:t>
-      </w:r>
+        <w:t xml:space="preserve">An explored set is </w:t>
+      </w:r>
+      <w:proofErr w:type="gramStart"/>
+      <w:r>
+        <w:t>defined</w:t>
+      </w:r>
+      <w:proofErr w:type="gramEnd"/>
       <w:r>
         <w:t xml:space="preserve"> and a cutoff</w:t>
       </w:r>
@@ -1617,13 +1652,29 @@
         <w:t>occurred tracking variable is defined.</w:t>
       </w:r>
       <w:r>
-        <w:t xml:space="preserve"> While the frontier is not empty, a node is popped from the frontier, a goal check is made and the node is added to the explored set.</w:t>
+        <w:t xml:space="preserve"> While the frontier is not empty, a node is popped from the frontier, a goal check is </w:t>
+      </w:r>
+      <w:proofErr w:type="gramStart"/>
+      <w:r>
+        <w:t>made</w:t>
+      </w:r>
+      <w:proofErr w:type="gramEnd"/>
+      <w:r>
+        <w:t xml:space="preserve"> and the node is added to the explored set.</w:t>
       </w:r>
       <w:r>
         <w:t xml:space="preserve"> Then for each neighbour</w:t>
       </w:r>
       <w:r>
-        <w:t>, if neighbour depth exceeds max depth, the neighbour is skipped and the cutoff occurred tracking variable is triggered.</w:t>
+        <w:t xml:space="preserve">, if neighbour depth exceeds max depth, the neighbour is </w:t>
+      </w:r>
+      <w:proofErr w:type="gramStart"/>
+      <w:r>
+        <w:t>skipped</w:t>
+      </w:r>
+      <w:proofErr w:type="gramEnd"/>
+      <w:r>
+        <w:t xml:space="preserve"> and the cutoff occurred tracking variable is triggered.</w:t>
       </w:r>
       <w:r>
         <w:t xml:space="preserve"> If not exceeding depth the neighbour is then added to the frontier if not already in the frontier or in the explored set.</w:t>
@@ -1647,12 +1698,14 @@
       <w:r>
         <w:t xml:space="preserve"> as the </w:t>
       </w:r>
+      <w:proofErr w:type="spellStart"/>
       <w:r>
         <w:rPr>
           <w:rStyle w:val="TextttChar"/>
         </w:rPr>
         <w:t>Maze.ids_solve</w:t>
       </w:r>
+      <w:proofErr w:type="spellEnd"/>
       <w:r>
         <w:t xml:space="preserve"> method</w:t>
       </w:r>
@@ -1717,115 +1770,115 @@
       <w:r>
         <w:t xml:space="preserve">like search algorithm utilising a configurable heuristic and the </w:t>
       </w:r>
+      <w:proofErr w:type="spellStart"/>
       <w:r>
         <w:rPr>
           <w:rStyle w:val="TextttChar"/>
         </w:rPr>
         <w:t>PriorityQueueFrontier</w:t>
       </w:r>
+      <w:proofErr w:type="spellEnd"/>
       <w:r>
         <w:t xml:space="preserve"> class.</w:t>
       </w:r>
       <w:r>
         <w:t xml:space="preserve"> Two separate A* methods were implemented as </w:t>
       </w:r>
+      <w:proofErr w:type="spellStart"/>
       <w:r>
         <w:rPr>
           <w:rStyle w:val="TextttChar"/>
         </w:rPr>
         <w:t>Maze.astar_solve</w:t>
       </w:r>
+      <w:proofErr w:type="spellEnd"/>
       <w:r>
         <w:t xml:space="preserve"> and </w:t>
       </w:r>
+      <w:proofErr w:type="spellStart"/>
       <w:r>
         <w:rPr>
           <w:rStyle w:val="TextttChar"/>
         </w:rPr>
         <w:t>Maze.astar_solve_consisent</w:t>
       </w:r>
+      <w:proofErr w:type="spellEnd"/>
+      <w:r>
+        <w:t xml:space="preserve"> to handle consistent and non-consistent heuristics.</w:t>
+      </w:r>
       <w:r>
         <w:t xml:space="preserve"> </w:t>
       </w:r>
       <w:r>
-        <w:t>to handle consistent and non-consistent heuristics.</w:t>
+        <w:t>The consistent variant (</w:t>
+      </w:r>
+      <w:proofErr w:type="spellStart"/>
+      <w:r>
+        <w:rPr>
+          <w:rStyle w:val="TextttChar"/>
+        </w:rPr>
+        <w:t>Maze.astar_solve_consisent</w:t>
+      </w:r>
+      <w:proofErr w:type="spellEnd"/>
+      <w:r>
+        <w:t xml:space="preserve">) </w:t>
+      </w:r>
+      <w:r>
+        <w:t>is</w:t>
+      </w:r>
+      <w:r>
+        <w:t xml:space="preserve"> complete and optimal provided the heuristic is consistent.</w:t>
       </w:r>
       <w:r>
         <w:t xml:space="preserve"> </w:t>
       </w:r>
       <w:r>
-        <w:t>The consistent variant (</w:t>
-      </w:r>
+        <w:t>The general variant (</w:t>
+      </w:r>
+      <w:proofErr w:type="spellStart"/>
       <w:r>
         <w:rPr>
           <w:rStyle w:val="TextttChar"/>
         </w:rPr>
-        <w:t>Maze.astar_solve_consisent</w:t>
-      </w:r>
+        <w:t>Maze.astar_solve</w:t>
+      </w:r>
+      <w:proofErr w:type="spellEnd"/>
       <w:r>
         <w:t xml:space="preserve">) </w:t>
       </w:r>
       <w:r>
-        <w:t>is</w:t>
-      </w:r>
-      <w:r>
-        <w:t xml:space="preserve"> complete and optimal provided the heuristic is consistent.</w:t>
+        <w:t>is comple</w:t>
+      </w:r>
+      <w:r>
+        <w:t>te and optimal provided the heuristic is admissible.</w:t>
+      </w:r>
+      <w:r>
+        <w:t xml:space="preserve"> The reason for the two separate implementations is that the consistent variations utilises both an early goal check and an expanded set to prevent no re-expansion. </w:t>
+      </w:r>
+    </w:p>
+    <w:p>
+      <w:r>
+        <w:t xml:space="preserve">The general </w:t>
+      </w:r>
+      <w:r>
+        <w:t>A* is implemented as follows. A starting node is defined with the starting state, no parent, no action and a depth of 0.</w:t>
       </w:r>
       <w:r>
         <w:t xml:space="preserve"> </w:t>
       </w:r>
       <w:r>
-        <w:t>The general variant (</w:t>
-      </w:r>
+        <w:t xml:space="preserve">A </w:t>
+      </w:r>
+      <w:proofErr w:type="spellStart"/>
       <w:r>
         <w:rPr>
           <w:rStyle w:val="TextttChar"/>
         </w:rPr>
-        <w:t>Maze.astar_solve</w:t>
-      </w:r>
-      <w:r>
-        <w:t xml:space="preserve">) </w:t>
-      </w:r>
-      <w:r>
-        <w:t>is comple</w:t>
-      </w:r>
-      <w:r>
-        <w:t>te and optimal provided the heuristic is admissible.</w:t>
-      </w:r>
-      <w:r>
-        <w:t xml:space="preserve"> The reason for the two separate implementations is that the consistent variations utilises both an early goal check and an expanded set to prevent no re-expansion. </w:t>
-      </w:r>
-    </w:p>
-    <w:p>
-      <w:r>
-        <w:t xml:space="preserve">The general </w:t>
-      </w:r>
-      <w:r>
-        <w:t xml:space="preserve">A* is implemented as follows. A </w:t>
-      </w:r>
-      <w:r>
-        <w:t>starting node is defined with the starting state, no parent, no action and a depth of 0.</w:t>
-      </w:r>
-      <w:r>
-        <w:t xml:space="preserve"> </w:t>
-      </w:r>
-      <w:r>
-        <w:t xml:space="preserve">A </w:t>
-      </w:r>
-      <w:r>
-        <w:rPr>
-          <w:rStyle w:val="TextttChar"/>
-        </w:rPr>
         <w:t>PriorityQueueFrontier</w:t>
       </w:r>
-      <w:r>
-        <w:t xml:space="preserve"> is defined and prepopulated with the starting node</w:t>
-      </w:r>
-      <w:r>
-        <w:t xml:space="preserve"> and a heuristic function</w:t>
-      </w:r>
-      <w:r>
-        <w:t>.</w:t>
+      <w:proofErr w:type="spellEnd"/>
+      <w:r>
+        <w:t xml:space="preserve"> is defined and prepopulated with the starting node and a heuristic function.</w:t>
       </w:r>
       <w:r>
         <w:t xml:space="preserve"> A reached dictionary is defined to keep track of reached nodes and their associated path costs.</w:t>
@@ -2659,18 +2712,281 @@
       </w:r>
     </w:p>
     <w:p>
-      <w:r>
+      <w:pPr>
         <w:rPr>
           <w:rFonts w:eastAsiaTheme="minorEastAsia"/>
         </w:rPr>
-        <w:t>&lt;&lt;comment on admissibility&gt;&gt;</w:t>
-      </w:r>
+      </w:pPr>
+      <w:r>
+        <w:rPr>
+          <w:rFonts w:eastAsiaTheme="minorEastAsia"/>
+        </w:rPr>
+        <w:t xml:space="preserve">While consistency implies admissibility, I will comment on the admissibility of the Manhattan heuristic. </w:t>
+      </w:r>
+      <w:r>
+        <w:rPr>
+          <w:rFonts w:eastAsiaTheme="minorEastAsia"/>
+        </w:rPr>
+        <w:t xml:space="preserve">Assume the maze world is 4-connected with no obstacles. </w:t>
+      </w:r>
+      <w:r>
+        <w:rPr>
+          <w:rFonts w:eastAsiaTheme="minorEastAsia"/>
+        </w:rPr>
+        <w:t>T</w:t>
+      </w:r>
+      <w:r>
+        <w:rPr>
+          <w:rFonts w:eastAsiaTheme="minorEastAsia"/>
+        </w:rPr>
+        <w:t xml:space="preserve">he shortest distance from the starting node to the goal point would be the difference in horizontal and vertical components as is in the Manhattan </w:t>
+      </w:r>
+      <w:r>
+        <w:rPr>
+          <w:rFonts w:eastAsiaTheme="minorEastAsia"/>
+        </w:rPr>
+        <w:t>h</w:t>
+      </w:r>
+      <w:r>
+        <w:rPr>
+          <w:rFonts w:eastAsiaTheme="minorEastAsia"/>
+        </w:rPr>
+        <w:t>euristic.</w:t>
+      </w:r>
+      <w:r>
+        <w:rPr>
+          <w:rFonts w:eastAsiaTheme="minorEastAsia"/>
+        </w:rPr>
+        <w:t xml:space="preserve"> When reintroducing obstacles to the world, the optimal path length will either be the same or increased</w:t>
+      </w:r>
+      <w:r>
+        <w:rPr>
+          <w:rFonts w:eastAsiaTheme="minorEastAsia"/>
+        </w:rPr>
+        <w:t xml:space="preserve">. </w:t>
+      </w:r>
+      <w:r>
+        <w:rPr>
+          <w:rFonts w:eastAsiaTheme="minorEastAsia"/>
+        </w:rPr>
+        <w:t>Therefore,</w:t>
+      </w:r>
+      <w:r>
+        <w:rPr>
+          <w:rFonts w:eastAsiaTheme="minorEastAsia"/>
+        </w:rPr>
+        <w:t xml:space="preserve"> </w:t>
+      </w:r>
+      <w:r>
+        <w:rPr>
+          <w:rFonts w:eastAsiaTheme="minorEastAsia"/>
+        </w:rPr>
+        <w:t xml:space="preserve">in our 4-connected world with obstacles, </w:t>
+      </w:r>
+      <w:r>
+        <w:rPr>
+          <w:rFonts w:eastAsiaTheme="minorEastAsia"/>
+        </w:rPr>
+        <w:t xml:space="preserve">the Manhattan heuristic </w:t>
+      </w:r>
+      <w:r>
+        <w:rPr>
+          <w:rFonts w:eastAsiaTheme="minorEastAsia"/>
+        </w:rPr>
+        <w:t>will</w:t>
+      </w:r>
+      <w:r>
+        <w:rPr>
+          <w:rFonts w:eastAsiaTheme="minorEastAsia"/>
+        </w:rPr>
+        <w:t xml:space="preserve"> not exceed the optimal path length</w:t>
+      </w:r>
+      <w:r>
+        <w:rPr>
+          <w:rFonts w:eastAsiaTheme="minorEastAsia"/>
+        </w:rPr>
+        <w:t>,</w:t>
+      </w:r>
+      <w:r>
+        <w:rPr>
+          <w:rFonts w:eastAsiaTheme="minorEastAsia"/>
+        </w:rPr>
+        <w:t xml:space="preserve"> meeting the requirements for admissibility (</w:t>
+      </w:r>
+      <m:oMath>
+        <m:r>
+          <w:rPr>
+            <w:rFonts w:ascii="Cambria Math" w:eastAsiaTheme="minorEastAsia" w:hAnsi="Cambria Math"/>
+          </w:rPr>
+          <m:t>∀ n</m:t>
+        </m:r>
+        <m:r>
+          <w:rPr>
+            <w:rFonts w:ascii="Cambria Math" w:eastAsiaTheme="minorEastAsia" w:hAnsi="Cambria Math"/>
+          </w:rPr>
+          <m:t xml:space="preserve">: </m:t>
+        </m:r>
+        <m:r>
+          <w:rPr>
+            <w:rFonts w:ascii="Cambria Math" w:eastAsiaTheme="minorEastAsia" w:hAnsi="Cambria Math"/>
+          </w:rPr>
+          <m:t>h</m:t>
+        </m:r>
+        <m:d>
+          <m:dPr>
+            <m:ctrlPr>
+              <w:rPr>
+                <w:rFonts w:ascii="Cambria Math" w:eastAsiaTheme="minorEastAsia" w:hAnsi="Cambria Math"/>
+                <w:i/>
+              </w:rPr>
+            </m:ctrlPr>
+          </m:dPr>
+          <m:e>
+            <m:r>
+              <w:rPr>
+                <w:rFonts w:ascii="Cambria Math" w:eastAsiaTheme="minorEastAsia" w:hAnsi="Cambria Math"/>
+              </w:rPr>
+              <m:t>n</m:t>
+            </m:r>
+          </m:e>
+        </m:d>
+        <m:r>
+          <w:rPr>
+            <w:rFonts w:ascii="Cambria Math" w:eastAsiaTheme="minorEastAsia" w:hAnsi="Cambria Math"/>
+          </w:rPr>
+          <m:t>≤</m:t>
+        </m:r>
+        <m:sSup>
+          <m:sSupPr>
+            <m:ctrlPr>
+              <w:rPr>
+                <w:rFonts w:ascii="Cambria Math" w:eastAsiaTheme="minorEastAsia" w:hAnsi="Cambria Math"/>
+                <w:i/>
+              </w:rPr>
+            </m:ctrlPr>
+          </m:sSupPr>
+          <m:e>
+            <m:r>
+              <w:rPr>
+                <w:rFonts w:ascii="Cambria Math" w:eastAsiaTheme="minorEastAsia" w:hAnsi="Cambria Math"/>
+              </w:rPr>
+              <m:t>h</m:t>
+            </m:r>
+          </m:e>
+          <m:sup>
+            <m:r>
+              <w:rPr>
+                <w:rFonts w:ascii="Cambria Math" w:eastAsiaTheme="minorEastAsia" w:hAnsi="Cambria Math"/>
+              </w:rPr>
+              <m:t>*</m:t>
+            </m:r>
+          </m:sup>
+        </m:sSup>
+        <m:d>
+          <m:dPr>
+            <m:ctrlPr>
+              <w:rPr>
+                <w:rFonts w:ascii="Cambria Math" w:eastAsiaTheme="minorEastAsia" w:hAnsi="Cambria Math"/>
+                <w:i/>
+              </w:rPr>
+            </m:ctrlPr>
+          </m:dPr>
+          <m:e>
+            <m:r>
+              <w:rPr>
+                <w:rFonts w:ascii="Cambria Math" w:eastAsiaTheme="minorEastAsia" w:hAnsi="Cambria Math"/>
+              </w:rPr>
+              <m:t>n</m:t>
+            </m:r>
+          </m:e>
+        </m:d>
+      </m:oMath>
+      <w:r>
+        <w:rPr>
+          <w:rFonts w:eastAsiaTheme="minorEastAsia"/>
+        </w:rPr>
+        <w:t xml:space="preserve"> </w:t>
+      </w:r>
+      <w:r>
+        <w:rPr>
+          <w:rFonts w:eastAsiaTheme="minorEastAsia"/>
+        </w:rPr>
+        <w:t xml:space="preserve">where </w:t>
+      </w:r>
+      <m:oMath>
+        <m:sSup>
+          <m:sSupPr>
+            <m:ctrlPr>
+              <w:rPr>
+                <w:rFonts w:ascii="Cambria Math" w:eastAsiaTheme="minorEastAsia" w:hAnsi="Cambria Math"/>
+                <w:i/>
+              </w:rPr>
+            </m:ctrlPr>
+          </m:sSupPr>
+          <m:e>
+            <m:r>
+              <w:rPr>
+                <w:rFonts w:ascii="Cambria Math" w:eastAsiaTheme="minorEastAsia" w:hAnsi="Cambria Math"/>
+              </w:rPr>
+              <m:t>h</m:t>
+            </m:r>
+          </m:e>
+          <m:sup>
+            <m:r>
+              <w:rPr>
+                <w:rFonts w:ascii="Cambria Math" w:eastAsiaTheme="minorEastAsia" w:hAnsi="Cambria Math"/>
+              </w:rPr>
+              <m:t>*</m:t>
+            </m:r>
+          </m:sup>
+        </m:sSup>
+        <m:r>
+          <w:rPr>
+            <w:rFonts w:ascii="Cambria Math" w:eastAsiaTheme="minorEastAsia" w:hAnsi="Cambria Math"/>
+          </w:rPr>
+          <m:t>(n)</m:t>
+        </m:r>
+      </m:oMath>
+      <w:r>
+        <w:rPr>
+          <w:rFonts w:eastAsiaTheme="minorEastAsia"/>
+        </w:rPr>
+        <w:t xml:space="preserve"> is the optimal path length from </w:t>
+      </w:r>
+      <m:oMath>
+        <m:r>
+          <w:rPr>
+            <w:rFonts w:ascii="Cambria Math" w:eastAsiaTheme="minorEastAsia" w:hAnsi="Cambria Math"/>
+          </w:rPr>
+          <m:t>n</m:t>
+        </m:r>
+      </m:oMath>
+      <w:r>
+        <w:rPr>
+          <w:rFonts w:eastAsiaTheme="minorEastAsia"/>
+        </w:rPr>
+        <w:t xml:space="preserve"> to the goal</w:t>
+      </w:r>
+      <w:r>
+        <w:rPr>
+          <w:rFonts w:eastAsiaTheme="minorEastAsia"/>
+        </w:rPr>
+        <w:t>).</w:t>
+      </w:r>
+    </w:p>
+    <w:p>
+      <w:pPr>
+        <w:rPr>
+          <w:rFonts w:eastAsiaTheme="minorEastAsia"/>
+        </w:rPr>
+      </w:pPr>
     </w:p>
     <w:p>
       <w:pPr>
         <w:pStyle w:val="Heading5"/>
       </w:pPr>
       <w:r>
+        <w:lastRenderedPageBreak/>
         <w:t>Euclidian Heur</w:t>
       </w:r>
       <w:r>
@@ -2963,95 +3279,411 @@
         <w:t>,</w:t>
       </w:r>
       <w:r>
+        <w:t xml:space="preserve"> Yuka Ariki</w:t>
+      </w:r>
+      <w:r>
+        <w:t xml:space="preserve"> and </w:t>
+      </w:r>
+      <w:r>
+        <w:t xml:space="preserve">Takuya </w:t>
+      </w:r>
+      <w:proofErr w:type="spellStart"/>
+      <w:r>
+        <w:t>Narihira</w:t>
+      </w:r>
+      <w:proofErr w:type="spellEnd"/>
+      <w:r>
+        <w:t xml:space="preserve"> showed that a small encoder-decoder neural network could be used to generate heuristic maps to inform A* search algorithms on a small </w:t>
+      </w:r>
+      <w:r>
+        <w:t>grid-based</w:t>
+      </w:r>
+      <w:r>
+        <w:t xml:space="preserve"> world.</w:t>
+      </w:r>
+      <w:r>
         <w:t xml:space="preserve"> </w:t>
       </w:r>
       <w:r>
-        <w:t>Yuka Ariki</w:t>
-      </w:r>
-      <w:r>
-        <w:t xml:space="preserve"> and </w:t>
-      </w:r>
-      <w:r>
-        <w:t>Takuya Narihira</w:t>
-      </w:r>
-      <w:r>
-        <w:t xml:space="preserve"> showed that a small encoder-decoder neural network could be used to generate heuristic maps to inform A* search algorithms on a small </w:t>
-      </w:r>
-      <w:r>
-        <w:t>grid-based</w:t>
-      </w:r>
-      <w:r>
-        <w:t xml:space="preserve"> world.</w:t>
+        <w:fldChar w:fldCharType="begin"/>
+      </w:r>
+      <w:r>
+        <w:instrText xml:space="preserve"> ADDIN ZOTERO_ITEM CSL_CITATION {"citationID":"aeELS0Ud","properties":{"formattedCitation":"(Ariki &amp; Narihira, 2019)","plainCitation":"(Ariki &amp; Narihira, 2019)","noteIndex":0},"citationItems":[{"id":710,"uris":["http://zotero.org/users/11468236/items/L2KLW8CI"],"itemData":{"id":710,"type":"article","abstract":"Path-planning algorithms are an important part of a wide variety of robotic applications, such as mobile robot navigation and robot arm manipulation. However, in large search spaces in which local traps may exist, it remains challenging to reliably find a path while satisfying real-time constraints. Efforts to speed up the path search have led to the development of many practical path-planning algorithms. These algorithms often define a search heuristic to guide the search towards the goal. The heuristics should be carefully designed for each specific problem to ensure reliability in the various situations encountered in the problem. However, it is often difficult for humans to craft such robust heuristics, and the search performance often degrades under conditions that violate the heuristic assumption. Rather than manually designing the heuristics, in this work, we propose a learning approach to acquire these search heuristics. Our method represents the environment containing the obstacles as an image, and this image is fed into fully convolutional neural networks to produce a search heuristic image where every pixel represents a heuristic value (cost-to-go value to a goal) in the form of a vertex of a search graph. Training the heuristic is performed using previously collected planning results. Our preliminary experiments (2D grid world navigation experiments) demonstrate significant reduction in the search costs relative to a hand-designed heuristic.","DOI":"10.48550/arXiv.1908.03343","note":"arXiv:1908.03343 [cs]","number":"arXiv:1908.03343","publisher":"arXiv","source":"arXiv.org","title":"Fully Convolutional Search Heuristic Learning for Rapid Path Planners","URL":"http://arxiv.org/abs/1908.03343","author":[{"family":"Ariki","given":"Yuka"},{"family":"Narihira","given":"Takuya"}],"accessed":{"date-parts":[["2025",8,20]]},"issued":{"date-parts":[["2019",8,9]]}}}],"schema":"https://github.com/citation-style-language/schema/raw/master/csl-citation.json"} </w:instrText>
+      </w:r>
+      <w:r>
+        <w:fldChar w:fldCharType="separate"/>
+      </w:r>
+      <w:r>
+        <w:t>(Ariki &amp; Narihira, 2019)</w:t>
+      </w:r>
+      <w:r>
+        <w:fldChar w:fldCharType="end"/>
       </w:r>
       <w:r>
         <w:t xml:space="preserve"> </w:t>
       </w:r>
       <w:r>
+        <w:t xml:space="preserve">Therefore, as an additional heuristic for Task 1, </w:t>
+      </w:r>
+      <w:r>
+        <w:t xml:space="preserve">I attempted to </w:t>
+      </w:r>
+      <w:r>
+        <w:t>reproduce</w:t>
+      </w:r>
+      <w:r>
+        <w:t xml:space="preserve"> their </w:t>
+      </w:r>
+      <w:r>
+        <w:t>results</w:t>
+      </w:r>
+      <w:r>
+        <w:t xml:space="preserve">. The </w:t>
+      </w:r>
+      <w:r>
+        <w:t xml:space="preserve">Python libraries </w:t>
+      </w:r>
+      <w:r>
+        <w:t xml:space="preserve">Flax and Jax </w:t>
+      </w:r>
+      <w:r>
+        <w:t>from Google</w:t>
+      </w:r>
+      <w:r>
+        <w:t xml:space="preserve"> were used to </w:t>
+      </w:r>
+      <w:r>
+        <w:t>implement and train the model respectively.</w:t>
+      </w:r>
+    </w:p>
+    <w:p>
+      <w:r>
+        <w:t xml:space="preserve">The model features a 224x224x3 tensor where </w:t>
+      </w:r>
+      <w:r>
+        <w:t>channel one</w:t>
+      </w:r>
+      <w:r>
+        <w:t xml:space="preserve"> is </w:t>
+      </w:r>
+      <w:proofErr w:type="spellStart"/>
+      <w:r>
+        <w:t>a</w:t>
+      </w:r>
+      <w:proofErr w:type="spellEnd"/>
+      <w:r>
+        <w:t xml:space="preserve"> binary obstacle map (0 for empty space, 1 for walls)</w:t>
+      </w:r>
+      <w:r>
+        <w:t>,</w:t>
+      </w:r>
+      <w:r>
+        <w:t xml:space="preserve"> channel two is a Euclidian transform of the obstacle map </w:t>
+      </w:r>
+      <w:r>
+        <w:t xml:space="preserve">and, channel three </w:t>
+      </w:r>
+      <w:r>
+        <w:t xml:space="preserve">is a </w:t>
+      </w:r>
+      <w:proofErr w:type="spellStart"/>
+      <w:r>
+        <w:t>euclidian</w:t>
+      </w:r>
+      <w:proofErr w:type="spellEnd"/>
+      <w:r>
+        <w:t xml:space="preserve"> distance map from the goal point</w:t>
+      </w:r>
+      <w:r>
+        <w:t xml:space="preserve"> (Figure 1</w:t>
+      </w:r>
+      <w:r>
+        <w:t>, A</w:t>
+      </w:r>
+      <w:r>
+        <w:t>)</w:t>
+      </w:r>
+      <w:r>
+        <w:t>.</w:t>
+      </w:r>
+      <w:r>
+        <w:t xml:space="preserve"> No input normalisation was performed.</w:t>
+      </w:r>
+      <w:r>
+        <w:t xml:space="preserve"> The output is a 224x224x1 tensor representing the heuristic value of each cell</w:t>
+      </w:r>
+      <w:r>
+        <w:t xml:space="preserve"> (Figure 1, B Prediction)</w:t>
+      </w:r>
+      <w:r>
+        <w:t>.</w:t>
+      </w:r>
+    </w:p>
+    <w:p>
+      <w:pPr>
+        <w:keepNext/>
+        <w:jc w:val="center"/>
+      </w:pPr>
+      <w:r>
+        <w:drawing>
+          <wp:inline distT="0" distB="0" distL="0" distR="0" wp14:anchorId="633049B1" wp14:editId="58AE4582">
+            <wp:extent cx="5079188" cy="3664528"/>
+            <wp:effectExtent l="0" t="0" r="7620" b="0"/>
+            <wp:docPr id="1465152502" name="Picture 1"/>
+            <wp:cNvGraphicFramePr>
+              <a:graphicFrameLocks xmlns:a="http://schemas.openxmlformats.org/drawingml/2006/main" noChangeAspect="1"/>
+            </wp:cNvGraphicFramePr>
+            <a:graphic xmlns:a="http://schemas.openxmlformats.org/drawingml/2006/main">
+              <a:graphicData uri="http://schemas.openxmlformats.org/drawingml/2006/picture">
+                <pic:pic xmlns:pic="http://schemas.openxmlformats.org/drawingml/2006/picture">
+                  <pic:nvPicPr>
+                    <pic:cNvPr id="1465152502" name=""/>
+                    <pic:cNvPicPr/>
+                  </pic:nvPicPr>
+                  <pic:blipFill>
+                    <a:blip r:embed="rId7"/>
+                    <a:stretch>
+                      <a:fillRect/>
+                    </a:stretch>
+                  </pic:blipFill>
+                  <pic:spPr>
+                    <a:xfrm>
+                      <a:off x="0" y="0"/>
+                      <a:ext cx="5083961" cy="3667972"/>
+                    </a:xfrm>
+                    <a:prstGeom prst="rect">
+                      <a:avLst/>
+                    </a:prstGeom>
+                  </pic:spPr>
+                </pic:pic>
+              </a:graphicData>
+            </a:graphic>
+          </wp:inline>
+        </w:drawing>
+      </w:r>
+    </w:p>
+    <w:p>
+      <w:pPr>
+        <w:pStyle w:val="Caption"/>
+        <w:rPr>
+          <w:i w:val="0"/>
+          <w:iCs w:val="0"/>
+          <w:color w:val="auto"/>
+        </w:rPr>
+      </w:pPr>
+      <w:r>
+        <w:rPr>
+          <w:i w:val="0"/>
+          <w:iCs w:val="0"/>
+          <w:color w:val="auto"/>
+        </w:rPr>
+        <w:t xml:space="preserve">Figure </w:t>
+      </w:r>
+      <w:r>
+        <w:rPr>
+          <w:i w:val="0"/>
+          <w:iCs w:val="0"/>
+          <w:color w:val="auto"/>
+        </w:rPr>
         <w:fldChar w:fldCharType="begin"/>
       </w:r>
       <w:r>
-        <w:instrText xml:space="preserve"> ADDIN ZOTERO_ITEM CSL_CITATION {"citationID":"aeELS0Ud","properties":{"formattedCitation":"(Ariki &amp; Narihira, 2019)","plainCitation":"(Ariki &amp; Narihira, 2019)","noteIndex":0},"citationItems":[{"id":710,"uris":["http://zotero.org/users/11468236/items/L2KLW8CI"],"itemData":{"id":710,"type":"article","abstract":"Path-planning algorithms are an important part of a wide variety of robotic applications, such as mobile robot navigation and robot arm manipulation. However, in large search spaces in which local traps may exist, it remains challenging to reliably find a path while satisfying real-time constraints. Efforts to speed up the path search have led to the development of many practical path-planning algorithms. These algorithms often define a search heuristic to guide the search towards the goal. The heuristics should be carefully designed for each specific problem to ensure reliability in the various situations encountered in the problem. However, it is often difficult for humans to craft such robust heuristics, and the search performance often degrades under conditions that violate the heuristic assumption. Rather than manually designing the heuristics, in this work, we propose a learning approach to acquire these search heuristics. Our method represents the environment containing the obstacles as an image, and this image is fed into fully convolutional neural networks to produce a search heuristic image where every pixel represents a heuristic value (cost-to-go value to a goal) in the form of a vertex of a search graph. Training the heuristic is performed using previously collected planning results. Our preliminary experiments (2D grid world navigation experiments) demonstrate significant reduction in the search costs relative to a hand-designed heuristic.","DOI":"10.48550/arXiv.1908.03343","note":"arXiv:1908.03343 [cs]","number":"arXiv:1908.03343","publisher":"arXiv","source":"arXiv.org","title":"Fully Convolutional Search Heuristic Learning for Rapid Path Planners","URL":"http://arxiv.org/abs/1908.03343","author":[{"family":"Ariki","given":"Yuka"},{"family":"Narihira","given":"Takuya"}],"accessed":{"date-parts":[["2025",8,20]]},"issued":{"date-parts":[["2019",8,9]]}}}],"schema":"https://github.com/citation-style-language/schema/raw/master/csl-citation.json"} </w:instrText>
-      </w:r>
-      <w:r>
+        <w:rPr>
+          <w:i w:val="0"/>
+          <w:iCs w:val="0"/>
+          <w:color w:val="auto"/>
+        </w:rPr>
+        <w:instrText xml:space="preserve"> SEQ Figure \* ARABIC </w:instrText>
+      </w:r>
+      <w:r>
+        <w:rPr>
+          <w:i w:val="0"/>
+          <w:iCs w:val="0"/>
+          <w:color w:val="auto"/>
+        </w:rPr>
         <w:fldChar w:fldCharType="separate"/>
       </w:r>
       <w:r>
-        <w:t>(Ariki &amp; Narihira, 2019)</w:t>
-      </w:r>
-      <w:r>
+        <w:rPr>
+          <w:i w:val="0"/>
+          <w:iCs w:val="0"/>
+          <w:noProof/>
+          <w:color w:val="auto"/>
+        </w:rPr>
+        <w:t>1</w:t>
+      </w:r>
+      <w:r>
+        <w:rPr>
+          <w:i w:val="0"/>
+          <w:iCs w:val="0"/>
+          <w:color w:val="auto"/>
+        </w:rPr>
         <w:fldChar w:fldCharType="end"/>
       </w:r>
       <w:r>
+        <w:rPr>
+          <w:i w:val="0"/>
+          <w:iCs w:val="0"/>
+          <w:color w:val="auto"/>
+        </w:rPr>
+        <w:t xml:space="preserve"> Sample model inputs and outputs. Sample input featur</w:t>
+      </w:r>
+      <w:r>
+        <w:rPr>
+          <w:i w:val="0"/>
+          <w:iCs w:val="0"/>
+          <w:color w:val="auto"/>
+        </w:rPr>
+        <w:t>es shown on A.</w:t>
+      </w:r>
+      <w:r>
+        <w:rPr>
+          <w:i w:val="0"/>
+          <w:iCs w:val="0"/>
+          <w:color w:val="auto"/>
+        </w:rPr>
+        <w:t xml:space="preserve"> Sample label, label mask and model prediction shown on B.</w:t>
+      </w:r>
+    </w:p>
+    <w:p>
+      <w:r>
+        <w:t xml:space="preserve">The model was trained on the </w:t>
+      </w:r>
+      <w:r>
+        <w:t xml:space="preserve">mazes subset of the </w:t>
+      </w:r>
+      <w:r>
+        <w:t>motion planning</w:t>
+      </w:r>
+      <w:r>
+        <w:t xml:space="preserve"> dataset</w:t>
+      </w:r>
+      <w:r>
         <w:t xml:space="preserve"> </w:t>
       </w:r>
       <w:r>
-        <w:t xml:space="preserve">Therefore, as an additional heuristic for Task 1, </w:t>
-      </w:r>
-      <w:r>
-        <w:t xml:space="preserve">I attempted to </w:t>
-      </w:r>
-      <w:r>
-        <w:t>reproduce</w:t>
-      </w:r>
-      <w:r>
-        <w:t xml:space="preserve"> their </w:t>
-      </w:r>
-      <w:r>
-        <w:t>results</w:t>
-      </w:r>
-      <w:r>
-        <w:t xml:space="preserve">. The </w:t>
-      </w:r>
-      <w:r>
-        <w:t xml:space="preserve">Python libraries </w:t>
-      </w:r>
-      <w:r>
-        <w:t xml:space="preserve">Flax and Jax </w:t>
-      </w:r>
-      <w:r>
-        <w:t>from Google</w:t>
-      </w:r>
-      <w:r>
-        <w:t xml:space="preserve"> were used to </w:t>
-      </w:r>
-      <w:r>
-        <w:t>implement and train the model respectively.</w:t>
-      </w:r>
-    </w:p>
-    <w:p/>
-    <w:p>
+        <w:fldChar w:fldCharType="begin"/>
+      </w:r>
+      <w:r>
+        <w:instrText xml:space="preserve"> ADDIN ZOTERO_ITEM CSL_CITATION {"citationID":"JXHYthzO","properties":{"formattedCitation":"(Bhardwaj, 2017/2025)","plainCitation":"(Bhardwaj, 2017/2025)","noteIndex":0},"citationItems":[{"id":734,"uris":["http://zotero.org/users/11468236/items/6TD6LXZY"],"itemData":{"id":734,"type":"software","abstract":"Datasets for testing motion planning algorithms.","license":"BSD-3-Clause","note":"original-date: 2017-10-13T17:52:14Z","source":"GitHub","title":"mohakbhardwaj/motion_planning_datasets","URL":"https://github.com/mohakbhardwaj/motion_planning_datasets","author":[{"family":"Bhardwaj","given":"Mohak"}],"accessed":{"date-parts":[["2025",8,25]]},"issued":{"date-parts":[["2025",8,24]]}}}],"schema":"https://github.com/citation-style-language/schema/raw/master/csl-citation.json"} </w:instrText>
+      </w:r>
+      <w:r>
+        <w:fldChar w:fldCharType="separate"/>
+      </w:r>
+      <w:r>
+        <w:t>(Bhardwaj, 2017/2025)</w:t>
+      </w:r>
+      <w:r>
+        <w:fldChar w:fldCharType="end"/>
+      </w:r>
+      <w:r>
+        <w:t xml:space="preserve"> </w:t>
+      </w:r>
+      <w:r>
+        <w:t>for 2200 epochs.</w:t>
+      </w:r>
+    </w:p>
+    <w:p>
+      <w:r>
+        <w:t xml:space="preserve">The </w:t>
+      </w:r>
+      <w:r>
+        <w:t xml:space="preserve">architecture implemented in </w:t>
+      </w:r>
+      <w:r>
+        <w:rPr>
+          <w:rStyle w:val="TextttChar"/>
+        </w:rPr>
+        <w:t>maze_src/cnn_heuristic/model.py</w:t>
+      </w:r>
+      <w:r>
+        <w:t xml:space="preserve"> features</w:t>
+      </w:r>
+      <w:r>
+        <w:t>:</w:t>
+      </w:r>
+      <w:r>
+        <w:t xml:space="preserve"> </w:t>
+      </w:r>
+      <w:r>
+        <w:t>three encoder stages (3→16→32→64) each us</w:t>
+      </w:r>
+      <w:r>
+        <w:t>ing</w:t>
+      </w:r>
+      <w:r>
+        <w:t xml:space="preserve"> a </w:t>
+      </w:r>
+      <w:proofErr w:type="spellStart"/>
+      <w:r>
+        <w:t>strided</w:t>
+      </w:r>
+      <w:proofErr w:type="spellEnd"/>
+      <w:r>
+        <w:t xml:space="preserve"> 3×3 conv </w:t>
+      </w:r>
+      <w:proofErr w:type="spellStart"/>
+      <w:r>
+        <w:t>downsample</w:t>
+      </w:r>
+      <w:proofErr w:type="spellEnd"/>
+      <w:r>
+        <w:t xml:space="preserve"> followed by two dilated 3×3 </w:t>
+      </w:r>
+      <w:proofErr w:type="spellStart"/>
+      <w:r>
+        <w:t>convs</w:t>
+      </w:r>
+      <w:proofErr w:type="spellEnd"/>
+      <w:r>
+        <w:t>, all with BatchNorm and leaky ReLU</w:t>
+      </w:r>
+      <w:r>
+        <w:t>;</w:t>
+      </w:r>
+      <w:r>
+        <w:t xml:space="preserve"> and</w:t>
+      </w:r>
+      <w:r>
+        <w:t xml:space="preserve"> three symmetric decoder stages us</w:t>
+      </w:r>
+      <w:r>
+        <w:t>ing</w:t>
+      </w:r>
+      <w:r>
+        <w:t xml:space="preserve"> a 4×4 transposed conv </w:t>
+      </w:r>
+      <w:proofErr w:type="spellStart"/>
+      <w:r>
+        <w:t>upsample</w:t>
+      </w:r>
+      <w:proofErr w:type="spellEnd"/>
+      <w:r>
+        <w:t xml:space="preserve"> followed by two 3×3 </w:t>
+      </w:r>
+      <w:proofErr w:type="spellStart"/>
+      <w:r>
+        <w:t>convs</w:t>
+      </w:r>
+      <w:proofErr w:type="spellEnd"/>
+      <w:r>
+        <w:t xml:space="preserve"> with BatchNorm and leaky ReLU; a final 1×1 conv produces the single output channel.</w:t>
+      </w:r>
+    </w:p>
+    <w:p>
+      <w:r>
+        <w:t>The CNN heuristic cannot be considered admissible or consistent.</w:t>
+      </w:r>
+    </w:p>
+    <w:p>
+      <w:pPr>
+        <w:pStyle w:val="Heading3"/>
+      </w:pPr>
       <w:r>
         <w:lastRenderedPageBreak/>
-        <w:t xml:space="preserve">… </w:t>
-      </w:r>
-      <w:r>
-        <w:t xml:space="preserve">definitely </w:t>
-      </w:r>
-      <w:r>
-        <w:t>not admissible or consistent.</w:t>
-      </w:r>
-    </w:p>
-    <w:p/>
+        <w:t>Experimental Results</w:t>
+      </w:r>
+    </w:p>
     <w:p>
       <w:pPr>
         <w:pStyle w:val="ListParagraph"/>
@@ -3061,7 +3693,7 @@
         </w:numPr>
       </w:pPr>
       <w:r>
-        <w:t>Manhattan heuristic has a large diamond frontier…</w:t>
+        <w:t>Benchmarks?</w:t>
       </w:r>
     </w:p>
     <w:p>
@@ -3073,358 +3705,7 @@
         </w:numPr>
       </w:pPr>
       <w:r>
-        <w:t>Euclidian would have a circular frontier</w:t>
-      </w:r>
-    </w:p>
-    <w:p/>
-    <w:p>
-      <w:r>
-        <w:t>For a heuristic</w:t>
-      </w:r>
-      <w:r>
-        <w:t xml:space="preserve"> </w:t>
-      </w:r>
-      <m:oMath>
-        <m:r>
-          <w:rPr>
-            <w:rFonts w:ascii="Cambria Math" w:hAnsi="Cambria Math"/>
-          </w:rPr>
-          <m:t>h</m:t>
-        </m:r>
-        <m:d>
-          <m:dPr>
-            <m:ctrlPr>
-              <w:rPr>
-                <w:rFonts w:ascii="Cambria Math" w:hAnsi="Cambria Math"/>
-                <w:i/>
-              </w:rPr>
-            </m:ctrlPr>
-          </m:dPr>
-          <m:e>
-            <m:r>
-              <w:rPr>
-                <w:rFonts w:ascii="Cambria Math" w:hAnsi="Cambria Math"/>
-              </w:rPr>
-              <m:t>n</m:t>
-            </m:r>
-          </m:e>
-        </m:d>
-      </m:oMath>
-      <w:r>
-        <w:t xml:space="preserve"> to be admissible, </w:t>
-      </w:r>
-      <w:r>
-        <w:t xml:space="preserve">for all nodes </w:t>
-      </w:r>
-      <m:oMath>
-        <m:r>
-          <w:rPr>
-            <w:rFonts w:ascii="Cambria Math" w:hAnsi="Cambria Math"/>
-          </w:rPr>
-          <m:t>n</m:t>
-        </m:r>
-      </m:oMath>
-      <w:r>
-        <w:rPr>
-          <w:rFonts w:eastAsiaTheme="minorEastAsia"/>
-        </w:rPr>
-        <w:t xml:space="preserve">, </w:t>
-      </w:r>
-      <m:oMath>
-        <m:r>
-          <w:rPr>
-            <w:rFonts w:ascii="Cambria Math" w:eastAsiaTheme="minorEastAsia" w:hAnsi="Cambria Math"/>
-          </w:rPr>
-          <m:t>h(n)</m:t>
-        </m:r>
-      </m:oMath>
-      <w:r>
-        <w:rPr>
-          <w:rFonts w:eastAsiaTheme="minorEastAsia"/>
-        </w:rPr>
-        <w:t xml:space="preserve"> must not overestimate the true cost to the goal</w:t>
-      </w:r>
-      <w:r>
-        <w:rPr>
-          <w:rFonts w:eastAsiaTheme="minorEastAsia"/>
-        </w:rPr>
-        <w:t>. (</w:t>
-      </w:r>
-      <m:oMath>
-        <m:r>
-          <w:rPr>
-            <w:rFonts w:ascii="Cambria Math" w:hAnsi="Cambria Math"/>
-          </w:rPr>
-          <m:t>∀ n: h</m:t>
-        </m:r>
-        <m:d>
-          <m:dPr>
-            <m:ctrlPr>
-              <w:rPr>
-                <w:rFonts w:ascii="Cambria Math" w:hAnsi="Cambria Math"/>
-                <w:i/>
-              </w:rPr>
-            </m:ctrlPr>
-          </m:dPr>
-          <m:e>
-            <m:r>
-              <w:rPr>
-                <w:rFonts w:ascii="Cambria Math" w:hAnsi="Cambria Math"/>
-              </w:rPr>
-              <m:t>n</m:t>
-            </m:r>
-          </m:e>
-        </m:d>
-        <m:r>
-          <w:rPr>
-            <w:rFonts w:ascii="Cambria Math" w:hAnsi="Cambria Math"/>
-          </w:rPr>
-          <m:t xml:space="preserve">≤ </m:t>
-        </m:r>
-        <m:sSup>
-          <m:sSupPr>
-            <m:ctrlPr>
-              <w:rPr>
-                <w:rFonts w:ascii="Cambria Math" w:hAnsi="Cambria Math"/>
-                <w:i/>
-              </w:rPr>
-            </m:ctrlPr>
-          </m:sSupPr>
-          <m:e>
-            <m:r>
-              <w:rPr>
-                <w:rFonts w:ascii="Cambria Math" w:hAnsi="Cambria Math"/>
-              </w:rPr>
-              <m:t>h</m:t>
-            </m:r>
-          </m:e>
-          <m:sup>
-            <m:r>
-              <w:rPr>
-                <w:rFonts w:ascii="Cambria Math" w:hAnsi="Cambria Math"/>
-              </w:rPr>
-              <m:t>*</m:t>
-            </m:r>
-          </m:sup>
-        </m:sSup>
-        <m:d>
-          <m:dPr>
-            <m:ctrlPr>
-              <w:rPr>
-                <w:rFonts w:ascii="Cambria Math" w:hAnsi="Cambria Math"/>
-                <w:i/>
-              </w:rPr>
-            </m:ctrlPr>
-          </m:dPr>
-          <m:e>
-            <m:r>
-              <w:rPr>
-                <w:rFonts w:ascii="Cambria Math" w:hAnsi="Cambria Math"/>
-              </w:rPr>
-              <m:t>n</m:t>
-            </m:r>
-          </m:e>
-        </m:d>
-      </m:oMath>
-      <w:r>
-        <w:rPr>
-          <w:rFonts w:eastAsiaTheme="minorEastAsia"/>
-        </w:rPr>
-        <w:t>)</w:t>
-      </w:r>
-      <w:r>
-        <w:rPr>
-          <w:rFonts w:eastAsiaTheme="minorEastAsia"/>
-        </w:rPr>
-        <w:t>.</w:t>
-      </w:r>
-    </w:p>
-    <w:p>
-      <w:pPr>
-        <w:rPr>
-          <w:rFonts w:eastAsiaTheme="minorEastAsia"/>
-        </w:rPr>
-      </w:pPr>
-      <w:r>
-        <w:rPr>
-          <w:rFonts w:eastAsiaTheme="minorEastAsia"/>
-        </w:rPr>
-        <w:t>To prove that the Manhattan heuristic is admissible, we may employ a proof by contradiction.</w:t>
-      </w:r>
-    </w:p>
-    <w:p>
-      <w:pPr>
-        <w:rPr>
-          <w:rFonts w:eastAsiaTheme="minorEastAsia"/>
-        </w:rPr>
-      </w:pPr>
-      <w:r>
-        <w:rPr>
-          <w:rFonts w:eastAsiaTheme="minorEastAsia"/>
-        </w:rPr>
-        <w:t xml:space="preserve">Assume that </w:t>
-      </w:r>
-      <m:oMath>
-        <m:r>
-          <w:rPr>
-            <w:rFonts w:ascii="Cambria Math" w:eastAsiaTheme="minorEastAsia" w:hAnsi="Cambria Math"/>
-          </w:rPr>
-          <m:t>h</m:t>
-        </m:r>
-      </m:oMath>
-      <w:r>
-        <w:rPr>
-          <w:rFonts w:eastAsiaTheme="minorEastAsia"/>
-        </w:rPr>
-        <w:t xml:space="preserve"> is not admissible, that is:</w:t>
-      </w:r>
-    </w:p>
-    <w:p>
-      <w:pPr>
-        <w:rPr>
-          <w:rFonts w:eastAsiaTheme="minorEastAsia"/>
-        </w:rPr>
-      </w:pPr>
-      <m:oMathPara>
-        <m:oMath>
-          <m:r>
-            <w:rPr>
-              <w:rFonts w:ascii="Cambria Math" w:eastAsiaTheme="minorEastAsia" w:hAnsi="Cambria Math"/>
-            </w:rPr>
-            <m:t>h</m:t>
-          </m:r>
-          <m:d>
-            <m:dPr>
-              <m:ctrlPr>
-                <w:rPr>
-                  <w:rFonts w:ascii="Cambria Math" w:eastAsiaTheme="minorEastAsia" w:hAnsi="Cambria Math"/>
-                  <w:i/>
-                </w:rPr>
-              </m:ctrlPr>
-            </m:dPr>
-            <m:e>
-              <m:r>
-                <w:rPr>
-                  <w:rFonts w:ascii="Cambria Math" w:eastAsiaTheme="minorEastAsia" w:hAnsi="Cambria Math"/>
-                </w:rPr>
-                <m:t>n</m:t>
-              </m:r>
-            </m:e>
-          </m:d>
-          <m:r>
-            <w:rPr>
-              <w:rFonts w:ascii="Cambria Math" w:eastAsiaTheme="minorEastAsia" w:hAnsi="Cambria Math"/>
-            </w:rPr>
-            <m:t>&gt;</m:t>
-          </m:r>
-          <m:sSup>
-            <m:sSupPr>
-              <m:ctrlPr>
-                <w:rPr>
-                  <w:rFonts w:ascii="Cambria Math" w:eastAsiaTheme="minorEastAsia" w:hAnsi="Cambria Math"/>
-                  <w:i/>
-                </w:rPr>
-              </m:ctrlPr>
-            </m:sSupPr>
-            <m:e>
-              <m:r>
-                <w:rPr>
-                  <w:rFonts w:ascii="Cambria Math" w:eastAsiaTheme="minorEastAsia" w:hAnsi="Cambria Math"/>
-                </w:rPr>
-                <m:t>h</m:t>
-              </m:r>
-            </m:e>
-            <m:sup>
-              <m:r>
-                <w:rPr>
-                  <w:rFonts w:ascii="Cambria Math" w:eastAsiaTheme="minorEastAsia" w:hAnsi="Cambria Math"/>
-                </w:rPr>
-                <m:t>*</m:t>
-              </m:r>
-            </m:sup>
-          </m:sSup>
-          <m:r>
-            <w:rPr>
-              <w:rFonts w:ascii="Cambria Math" w:eastAsiaTheme="minorEastAsia" w:hAnsi="Cambria Math"/>
-            </w:rPr>
-            <m:t>(n)</m:t>
-          </m:r>
-        </m:oMath>
-      </m:oMathPara>
-    </w:p>
-    <w:p>
-      <w:pPr>
-        <w:rPr>
-          <w:rFonts w:eastAsiaTheme="minorEastAsia"/>
-        </w:rPr>
-      </w:pPr>
-      <w:r>
-        <w:rPr>
-          <w:rFonts w:eastAsiaTheme="minorEastAsia"/>
-        </w:rPr>
-        <w:t xml:space="preserve">where </w:t>
-      </w:r>
-      <m:oMath>
-        <m:sSup>
-          <m:sSupPr>
-            <m:ctrlPr>
-              <w:rPr>
-                <w:rFonts w:ascii="Cambria Math" w:eastAsiaTheme="minorEastAsia" w:hAnsi="Cambria Math"/>
-                <w:i/>
-              </w:rPr>
-            </m:ctrlPr>
-          </m:sSupPr>
-          <m:e>
-            <m:r>
-              <w:rPr>
-                <w:rFonts w:ascii="Cambria Math" w:eastAsiaTheme="minorEastAsia" w:hAnsi="Cambria Math"/>
-              </w:rPr>
-              <m:t>h</m:t>
-            </m:r>
-          </m:e>
-          <m:sup>
-            <m:r>
-              <w:rPr>
-                <w:rFonts w:ascii="Cambria Math" w:eastAsiaTheme="minorEastAsia" w:hAnsi="Cambria Math"/>
-              </w:rPr>
-              <m:t>*</m:t>
-            </m:r>
-          </m:sup>
-        </m:sSup>
-        <m:r>
-          <w:rPr>
-            <w:rFonts w:ascii="Cambria Math" w:eastAsiaTheme="minorEastAsia" w:hAnsi="Cambria Math"/>
-          </w:rPr>
-          <m:t>(n)</m:t>
-        </m:r>
-      </m:oMath>
-      <w:r>
-        <w:rPr>
-          <w:rFonts w:eastAsiaTheme="minorEastAsia"/>
-        </w:rPr>
-        <w:t xml:space="preserve"> is the optimal path length from </w:t>
-      </w:r>
-      <m:oMath>
-        <m:r>
-          <w:rPr>
-            <w:rFonts w:ascii="Cambria Math" w:eastAsiaTheme="minorEastAsia" w:hAnsi="Cambria Math"/>
-          </w:rPr>
-          <m:t>n</m:t>
-        </m:r>
-      </m:oMath>
-      <w:r>
-        <w:rPr>
-          <w:rFonts w:eastAsiaTheme="minorEastAsia"/>
-        </w:rPr>
-        <w:t xml:space="preserve"> to the goal.</w:t>
-      </w:r>
-    </w:p>
-    <w:p>
-      <w:pPr>
-        <w:pStyle w:val="Heading3"/>
-      </w:pPr>
-      <w:r>
-        <w:t>Experimental Results</w:t>
+        <w:t>Discussion on shape of heuristic?</w:t>
       </w:r>
     </w:p>
     <w:p>
@@ -3436,7 +3717,13 @@
         </w:numPr>
       </w:pPr>
       <w:r>
-        <w:t>Benchmarks?</w:t>
+        <w:t>Comparison of different heuristics?</w:t>
+      </w:r>
+    </w:p>
+    <w:p/>
+    <w:p>
+      <w:r>
+        <w:t>Maybe table with:</w:t>
       </w:r>
     </w:p>
     <w:p>
@@ -3448,7 +3735,7 @@
         </w:numPr>
       </w:pPr>
       <w:r>
-        <w:t>Discussion on shape of heuristic?</w:t>
+        <w:t>Example Name</w:t>
       </w:r>
     </w:p>
     <w:p>
@@ -3460,13 +3747,7 @@
         </w:numPr>
       </w:pPr>
       <w:r>
-        <w:t>Comparison of different heuristics?</w:t>
-      </w:r>
-    </w:p>
-    <w:p/>
-    <w:p>
-      <w:r>
-        <w:t>Maybe table with:</w:t>
+        <w:t>Algorithm</w:t>
       </w:r>
     </w:p>
     <w:p>
@@ -3478,7 +3759,7 @@
         </w:numPr>
       </w:pPr>
       <w:r>
-        <w:t>Example Name</w:t>
+        <w:t>Runtime</w:t>
       </w:r>
     </w:p>
     <w:p>
@@ -3490,7 +3771,7 @@
         </w:numPr>
       </w:pPr>
       <w:r>
-        <w:t>Algorithm</w:t>
+        <w:t>Heuristic</w:t>
       </w:r>
     </w:p>
     <w:p>
@@ -3502,7 +3783,7 @@
         </w:numPr>
       </w:pPr>
       <w:r>
-        <w:t>Runtime</w:t>
+        <w:t>Path Cost</w:t>
       </w:r>
     </w:p>
     <w:p>
@@ -3514,7 +3795,7 @@
         </w:numPr>
       </w:pPr>
       <w:r>
-        <w:t>Heuristic</w:t>
+        <w:t>Explored states</w:t>
       </w:r>
     </w:p>
     <w:p>
@@ -3526,30 +3807,6 @@
         </w:numPr>
       </w:pPr>
       <w:r>
-        <w:t>Path Cost</w:t>
-      </w:r>
-    </w:p>
-    <w:p>
-      <w:pPr>
-        <w:pStyle w:val="ListParagraph"/>
-        <w:numPr>
-          <w:ilvl w:val="0"/>
-          <w:numId w:val="5"/>
-        </w:numPr>
-      </w:pPr>
-      <w:r>
-        <w:t>Explored states</w:t>
-      </w:r>
-    </w:p>
-    <w:p>
-      <w:pPr>
-        <w:pStyle w:val="ListParagraph"/>
-        <w:numPr>
-          <w:ilvl w:val="0"/>
-          <w:numId w:val="5"/>
-        </w:numPr>
-      </w:pPr>
-      <w:r>
         <w:t>Image</w:t>
       </w:r>
     </w:p>
@@ -3569,6 +3826,94 @@
       </w:pPr>
       <w:r>
         <w:t>Task 2 – Solving a Cross Word</w:t>
+      </w:r>
+    </w:p>
+    <w:p/>
+    <w:p/>
+    <w:p/>
+    <w:p/>
+    <w:p>
+      <w:pPr>
+        <w:pStyle w:val="Bibliography"/>
+      </w:pPr>
+      <w:r>
+        <w:fldChar w:fldCharType="begin"/>
+      </w:r>
+      <w:r>
+        <w:instrText xml:space="preserve"> ADDIN ZOTERO_BIBL {"uncited":[],"omitted":[],"custom":[]} CSL_BIBLIOGRAPHY </w:instrText>
+      </w:r>
+      <w:r>
+        <w:fldChar w:fldCharType="separate"/>
+      </w:r>
+      <w:r>
+        <w:t xml:space="preserve">Ariki, Y., &amp; </w:t>
+      </w:r>
+      <w:proofErr w:type="spellStart"/>
+      <w:r>
+        <w:t>Narihira</w:t>
+      </w:r>
+      <w:proofErr w:type="spellEnd"/>
+      <w:r>
+        <w:t xml:space="preserve">, T. (2019). </w:t>
+      </w:r>
+      <w:r>
+        <w:rPr>
+          <w:i/>
+          <w:iCs/>
+        </w:rPr>
+        <w:t>Fully Convolutional Search Heuristic Learning for Rapid Path Planners</w:t>
+      </w:r>
+      <w:r>
+        <w:t xml:space="preserve"> (No. arXiv:1908.03343). </w:t>
+      </w:r>
+      <w:proofErr w:type="spellStart"/>
+      <w:r>
+        <w:t>arXiv</w:t>
+      </w:r>
+      <w:proofErr w:type="spellEnd"/>
+      <w:r>
+        <w:t>. https://doi.org/10.48550/arXiv.1908.03343</w:t>
+      </w:r>
+    </w:p>
+    <w:p>
+      <w:pPr>
+        <w:pStyle w:val="Bibliography"/>
+      </w:pPr>
+      <w:r>
+        <w:t xml:space="preserve">Bhardwaj, M. (2025). </w:t>
+      </w:r>
+      <w:proofErr w:type="spellStart"/>
+      <w:r>
+        <w:rPr>
+          <w:i/>
+          <w:iCs/>
+        </w:rPr>
+        <w:t>Mohakbhardwaj</w:t>
+      </w:r>
+      <w:proofErr w:type="spellEnd"/>
+      <w:r>
+        <w:rPr>
+          <w:i/>
+          <w:iCs/>
+        </w:rPr>
+        <w:t>/</w:t>
+      </w:r>
+      <w:proofErr w:type="spellStart"/>
+      <w:r>
+        <w:rPr>
+          <w:i/>
+          <w:iCs/>
+        </w:rPr>
+        <w:t>motion_planning_datasets</w:t>
+      </w:r>
+      <w:proofErr w:type="spellEnd"/>
+      <w:r>
+        <w:t xml:space="preserve"> [Computer software]. https://github.com/mohakbhardwaj/motion_planning_datasets (Original work published 2017)</w:t>
+      </w:r>
+    </w:p>
+    <w:p>
+      <w:r>
+        <w:fldChar w:fldCharType="end"/>
       </w:r>
     </w:p>
     <w:sectPr>
@@ -4477,7 +4822,7 @@
   <w:style w:type="paragraph" w:default="1" w:styleId="Normal">
     <w:name w:val="Normal"/>
     <w:qFormat/>
-    <w:rsid w:val="00827002"/>
+    <w:rsid w:val="00DD1D99"/>
     <w:rPr>
       <w:rFonts w:ascii="Arial" w:hAnsi="Arial" w:cs="Arial"/>
     </w:rPr>
@@ -5096,6 +5441,37 @@
       <w:szCs w:val="20"/>
     </w:rPr>
   </w:style>
+  <w:style w:type="paragraph" w:styleId="Caption">
+    <w:name w:val="caption"/>
+    <w:basedOn w:val="Normal"/>
+    <w:next w:val="Normal"/>
+    <w:uiPriority w:val="35"/>
+    <w:unhideWhenUsed/>
+    <w:qFormat/>
+    <w:rsid w:val="002E2A82"/>
+    <w:pPr>
+      <w:spacing w:after="200" w:line="240" w:lineRule="auto"/>
+    </w:pPr>
+    <w:rPr>
+      <w:i/>
+      <w:iCs/>
+      <w:color w:val="0E2841" w:themeColor="text2"/>
+      <w:sz w:val="18"/>
+      <w:szCs w:val="18"/>
+    </w:rPr>
+  </w:style>
+  <w:style w:type="paragraph" w:styleId="Bibliography">
+    <w:name w:val="Bibliography"/>
+    <w:basedOn w:val="Normal"/>
+    <w:next w:val="Normal"/>
+    <w:uiPriority w:val="37"/>
+    <w:unhideWhenUsed/>
+    <w:rsid w:val="00BD2174"/>
+    <w:pPr>
+      <w:spacing w:after="0" w:line="480" w:lineRule="auto"/>
+      <w:ind w:left="720" w:hanging="720"/>
+    </w:pPr>
+  </w:style>
 </w:styles>
 </file>
 

</xml_diff>

<commit_message>
I have no idea what I had done in depth limited search before now
</commit_message>
<xml_diff>
--- a/2802ict-assignments/assignment_01/Report.docx
+++ b/2802ict-assignments/assignment_01/Report.docx
@@ -1257,15 +1257,7 @@
           </w:tcPr>
           <w:p>
             <w:r>
-              <w:t xml:space="preserve">A Python </w:t>
-            </w:r>
-            <w:proofErr w:type="spellStart"/>
-            <w:r>
-              <w:t>dataclass</w:t>
-            </w:r>
-            <w:proofErr w:type="spellEnd"/>
-            <w:r>
-              <w:t xml:space="preserve"> </w:t>
+              <w:t xml:space="preserve">A Python dataclass </w:t>
             </w:r>
             <w:r>
               <w:t xml:space="preserve">storing </w:t>
@@ -1289,7 +1281,6 @@
                 <w:bCs/>
               </w:rPr>
             </w:pPr>
-            <w:proofErr w:type="spellStart"/>
             <w:r>
               <w:rPr>
                 <w:rFonts w:ascii="Consolas" w:hAnsi="Consolas"/>
@@ -1300,7 +1291,6 @@
               </w:rPr>
               <w:t>FrontierADT</w:t>
             </w:r>
-            <w:proofErr w:type="spellEnd"/>
           </w:p>
         </w:tc>
         <w:tc>
@@ -1327,7 +1317,6 @@
                 <w:bCs/>
               </w:rPr>
             </w:pPr>
-            <w:proofErr w:type="spellStart"/>
             <w:r>
               <w:rPr>
                 <w:rFonts w:ascii="Consolas" w:hAnsi="Consolas"/>
@@ -1338,7 +1327,6 @@
               </w:rPr>
               <w:t>StackFrontier</w:t>
             </w:r>
-            <w:proofErr w:type="spellEnd"/>
           </w:p>
         </w:tc>
         <w:tc>
@@ -1349,14 +1337,12 @@
             <w:r>
               <w:t xml:space="preserve">A </w:t>
             </w:r>
-            <w:proofErr w:type="spellStart"/>
             <w:r>
               <w:rPr>
                 <w:rStyle w:val="TextttChar"/>
               </w:rPr>
               <w:t>FrontierADT</w:t>
             </w:r>
-            <w:proofErr w:type="spellEnd"/>
             <w:r>
               <w:t xml:space="preserve"> implementation leveraging a last-in-last-out stack for use in the depth-limited depth-first search method.</w:t>
             </w:r>
@@ -1376,7 +1362,6 @@
                 <w:bCs/>
               </w:rPr>
             </w:pPr>
-            <w:proofErr w:type="spellStart"/>
             <w:r>
               <w:rPr>
                 <w:rFonts w:ascii="Consolas" w:hAnsi="Consolas"/>
@@ -1387,7 +1372,6 @@
               </w:rPr>
               <w:t>PriorityQueueFrontier</w:t>
             </w:r>
-            <w:proofErr w:type="spellEnd"/>
           </w:p>
         </w:tc>
         <w:tc>
@@ -1398,22 +1382,18 @@
             <w:r>
               <w:t xml:space="preserve">A </w:t>
             </w:r>
-            <w:proofErr w:type="spellStart"/>
             <w:r>
               <w:rPr>
                 <w:rStyle w:val="TextttChar"/>
               </w:rPr>
               <w:t>FrontierADT</w:t>
             </w:r>
-            <w:proofErr w:type="spellEnd"/>
             <w:r>
               <w:t xml:space="preserve"> implementation leveraging a priority-heap for use in the A* search method. On construction it accepts a method </w:t>
             </w:r>
-            <w:proofErr w:type="spellStart"/>
             <w:r>
               <w:t>cost_fn</w:t>
             </w:r>
-            <w:proofErr w:type="spellEnd"/>
             <w:r>
               <w:t xml:space="preserve"> to compute node cost.</w:t>
             </w:r>
@@ -1485,7 +1465,6 @@
       <w:r>
         <w:t xml:space="preserve">mplemented as the </w:t>
       </w:r>
-      <w:proofErr w:type="spellStart"/>
       <w:r>
         <w:rPr>
           <w:rStyle w:val="TextttChar"/>
@@ -1498,7 +1477,6 @@
         </w:rPr>
         <w:t>dfs_solve</w:t>
       </w:r>
-      <w:proofErr w:type="spellEnd"/>
       <w:r>
         <w:rPr>
           <w:sz w:val="20"/>
@@ -1525,19 +1503,23 @@
         <w:t>n uninformed</w:t>
       </w:r>
       <w:r>
-        <w:t xml:space="preserve"> pre-order graph-like search </w:t>
+        <w:t xml:space="preserve"> pre-order </w:t>
+      </w:r>
+      <w:r>
+        <w:t>tree</w:t>
+      </w:r>
+      <w:r>
+        <w:t xml:space="preserve">-like search </w:t>
       </w:r>
       <w:r>
         <w:t xml:space="preserve">leveraging the </w:t>
       </w:r>
-      <w:proofErr w:type="spellStart"/>
       <w:r>
         <w:rPr>
           <w:rStyle w:val="TextttChar"/>
         </w:rPr>
         <w:t>StackFrontier</w:t>
       </w:r>
-      <w:proofErr w:type="spellEnd"/>
       <w:r>
         <w:t xml:space="preserve"> class.</w:t>
       </w:r>
@@ -1547,14 +1529,12 @@
       <w:r>
         <w:t xml:space="preserve">On failure to find the goal node the method will raise </w:t>
       </w:r>
-      <w:proofErr w:type="spellStart"/>
       <w:r>
         <w:rPr>
           <w:rStyle w:val="TextttChar"/>
         </w:rPr>
         <w:t>DepthLimitReachedError</w:t>
       </w:r>
-      <w:proofErr w:type="spellEnd"/>
       <w:r>
         <w:rPr>
           <w:sz w:val="18"/>
@@ -1589,16 +1569,20 @@
         <w:t xml:space="preserve">where a depth cutoff does and does not occur respectively. </w:t>
       </w:r>
       <w:r>
-        <w:t xml:space="preserve">The method is complete provided the goal depth exceeds the </w:t>
-      </w:r>
-      <w:proofErr w:type="spellStart"/>
+        <w:t>The method is complete provided the goal depth</w:t>
+      </w:r>
+      <w:r>
+        <w:t xml:space="preserve"> does not exceed</w:t>
+      </w:r>
+      <w:r>
+        <w:t xml:space="preserve"> the </w:t>
+      </w:r>
       <w:r>
         <w:rPr>
           <w:rStyle w:val="TextttChar"/>
         </w:rPr>
         <w:t>max_depth</w:t>
       </w:r>
-      <w:proofErr w:type="spellEnd"/>
       <w:r>
         <w:t xml:space="preserve"> argument </w:t>
       </w:r>
@@ -1614,14 +1598,12 @@
       <w:r>
         <w:t xml:space="preserve">A starting node is defined with the starting state, no parent, no action and a depth of 0. A </w:t>
       </w:r>
-      <w:proofErr w:type="spellStart"/>
       <w:r>
         <w:rPr>
           <w:rStyle w:val="TextttChar"/>
         </w:rPr>
         <w:t>StackFrontier</w:t>
       </w:r>
-      <w:proofErr w:type="spellEnd"/>
       <w:r>
         <w:t xml:space="preserve"> is</w:t>
       </w:r>
@@ -1635,49 +1617,43 @@
         <w:t xml:space="preserve"> </w:t>
       </w:r>
       <w:r>
-        <w:t xml:space="preserve">An explored set is </w:t>
-      </w:r>
-      <w:proofErr w:type="gramStart"/>
-      <w:r>
-        <w:t>defined</w:t>
-      </w:r>
-      <w:proofErr w:type="gramEnd"/>
-      <w:r>
-        <w:t xml:space="preserve"> and a cutoff</w:t>
+        <w:t>A</w:t>
+      </w:r>
+      <w:r>
+        <w:t xml:space="preserve"> cutoff occurred</w:t>
+      </w:r>
+      <w:r>
+        <w:t xml:space="preserve"> tracking variable is defined.</w:t>
+      </w:r>
+      <w:r>
+        <w:t xml:space="preserve"> While the frontier is not empty, a node is popped from the frontier</w:t>
+      </w:r>
+      <w:r>
+        <w:t xml:space="preserve"> and</w:t>
+      </w:r>
+      <w:r>
+        <w:t xml:space="preserve"> a goal check is made.</w:t>
+      </w:r>
+      <w:r>
+        <w:t xml:space="preserve"> Then for each neighbour</w:t>
+      </w:r>
+      <w:r>
+        <w:t>, if neighbour depth exceeds max depth, the neighbour is skipped and the cutoff occurred tracking variable is triggered.</w:t>
+      </w:r>
+      <w:r>
+        <w:t xml:space="preserve"> If</w:t>
+      </w:r>
+      <w:r>
+        <w:t xml:space="preserve"> the neighbour already exists in the path to the current node (cycle tracking)</w:t>
       </w:r>
       <w:r>
         <w:t xml:space="preserve"> </w:t>
       </w:r>
       <w:r>
-        <w:t>occurred tracking variable is defined.</w:t>
-      </w:r>
-      <w:r>
-        <w:t xml:space="preserve"> While the frontier is not empty, a node is popped from the frontier, a goal check is </w:t>
-      </w:r>
-      <w:proofErr w:type="gramStart"/>
-      <w:r>
-        <w:t>made</w:t>
-      </w:r>
-      <w:proofErr w:type="gramEnd"/>
-      <w:r>
-        <w:t xml:space="preserve"> and the node is added to the explored set.</w:t>
-      </w:r>
-      <w:r>
-        <w:t xml:space="preserve"> Then for each neighbour</w:t>
-      </w:r>
-      <w:r>
-        <w:t xml:space="preserve">, if neighbour depth exceeds max depth, the neighbour is </w:t>
-      </w:r>
-      <w:proofErr w:type="gramStart"/>
-      <w:r>
-        <w:t>skipped</w:t>
-      </w:r>
-      <w:proofErr w:type="gramEnd"/>
-      <w:r>
-        <w:t xml:space="preserve"> and the cutoff occurred tracking variable is triggered.</w:t>
-      </w:r>
-      <w:r>
-        <w:t xml:space="preserve"> If not exceeding depth the neighbour is then added to the frontier if not already in the frontier or in the explored set.</w:t>
+        <w:t>it is skipped, otherwise it is added to the frontier</w:t>
+      </w:r>
+      <w:r>
+        <w:t>.</w:t>
       </w:r>
     </w:p>
     <w:p>
@@ -1698,14 +1674,12 @@
       <w:r>
         <w:t xml:space="preserve"> as the </w:t>
       </w:r>
-      <w:proofErr w:type="spellStart"/>
       <w:r>
         <w:rPr>
           <w:rStyle w:val="TextttChar"/>
         </w:rPr>
         <w:t>Maze.ids_solve</w:t>
       </w:r>
-      <w:proofErr w:type="spellEnd"/>
       <w:r>
         <w:t xml:space="preserve"> method</w:t>
       </w:r>
@@ -1770,39 +1744,33 @@
       <w:r>
         <w:t xml:space="preserve">like search algorithm utilising a configurable heuristic and the </w:t>
       </w:r>
-      <w:proofErr w:type="spellStart"/>
       <w:r>
         <w:rPr>
           <w:rStyle w:val="TextttChar"/>
         </w:rPr>
         <w:t>PriorityQueueFrontier</w:t>
       </w:r>
-      <w:proofErr w:type="spellEnd"/>
       <w:r>
         <w:t xml:space="preserve"> class.</w:t>
       </w:r>
       <w:r>
         <w:t xml:space="preserve"> Two separate A* methods were implemented as </w:t>
       </w:r>
-      <w:proofErr w:type="spellStart"/>
       <w:r>
         <w:rPr>
           <w:rStyle w:val="TextttChar"/>
         </w:rPr>
         <w:t>Maze.astar_solve</w:t>
       </w:r>
-      <w:proofErr w:type="spellEnd"/>
       <w:r>
         <w:t xml:space="preserve"> and </w:t>
       </w:r>
-      <w:proofErr w:type="spellStart"/>
       <w:r>
         <w:rPr>
           <w:rStyle w:val="TextttChar"/>
         </w:rPr>
         <w:t>Maze.astar_solve_consisent</w:t>
       </w:r>
-      <w:proofErr w:type="spellEnd"/>
       <w:r>
         <w:t xml:space="preserve"> to handle consistent and non-consistent heuristics.</w:t>
       </w:r>
@@ -1812,14 +1780,12 @@
       <w:r>
         <w:t>The consistent variant (</w:t>
       </w:r>
-      <w:proofErr w:type="spellStart"/>
       <w:r>
         <w:rPr>
           <w:rStyle w:val="TextttChar"/>
         </w:rPr>
         <w:t>Maze.astar_solve_consisent</w:t>
       </w:r>
-      <w:proofErr w:type="spellEnd"/>
       <w:r>
         <w:t xml:space="preserve">) </w:t>
       </w:r>
@@ -1835,14 +1801,12 @@
       <w:r>
         <w:t>The general variant (</w:t>
       </w:r>
-      <w:proofErr w:type="spellStart"/>
       <w:r>
         <w:rPr>
           <w:rStyle w:val="TextttChar"/>
         </w:rPr>
         <w:t>Maze.astar_solve</w:t>
       </w:r>
-      <w:proofErr w:type="spellEnd"/>
       <w:r>
         <w:t xml:space="preserve">) </w:t>
       </w:r>
@@ -1869,14 +1833,12 @@
       <w:r>
         <w:t xml:space="preserve">A </w:t>
       </w:r>
-      <w:proofErr w:type="spellStart"/>
       <w:r>
         <w:rPr>
           <w:rStyle w:val="TextttChar"/>
         </w:rPr>
         <w:t>PriorityQueueFrontier</w:t>
       </w:r>
-      <w:proofErr w:type="spellEnd"/>
       <w:r>
         <w:t xml:space="preserve"> is defined and prepopulated with the starting node and a heuristic function.</w:t>
       </w:r>
@@ -2818,19 +2780,7 @@
           <w:rPr>
             <w:rFonts w:ascii="Cambria Math" w:eastAsiaTheme="minorEastAsia" w:hAnsi="Cambria Math"/>
           </w:rPr>
-          <m:t>∀ n</m:t>
-        </m:r>
-        <m:r>
-          <w:rPr>
-            <w:rFonts w:ascii="Cambria Math" w:eastAsiaTheme="minorEastAsia" w:hAnsi="Cambria Math"/>
-          </w:rPr>
-          <m:t xml:space="preserve">: </m:t>
-        </m:r>
-        <m:r>
-          <w:rPr>
-            <w:rFonts w:ascii="Cambria Math" w:eastAsiaTheme="minorEastAsia" w:hAnsi="Cambria Math"/>
-          </w:rPr>
-          <m:t>h</m:t>
+          <m:t>∀ n: h</m:t>
         </m:r>
         <m:d>
           <m:dPr>
@@ -2905,13 +2855,7 @@
         <w:rPr>
           <w:rFonts w:eastAsiaTheme="minorEastAsia"/>
         </w:rPr>
-        <w:t xml:space="preserve"> </w:t>
-      </w:r>
-      <w:r>
-        <w:rPr>
-          <w:rFonts w:eastAsiaTheme="minorEastAsia"/>
-        </w:rPr>
-        <w:t xml:space="preserve">where </w:t>
+        <w:t xml:space="preserve"> where </w:t>
       </w:r>
       <m:oMath>
         <m:sSup>
@@ -2965,20 +2909,14 @@
         <w:rPr>
           <w:rFonts w:eastAsiaTheme="minorEastAsia"/>
         </w:rPr>
-        <w:t xml:space="preserve"> to the goal</w:t>
-      </w:r>
-      <w:r>
+        <w:t xml:space="preserve"> to the goal).</w:t>
+      </w:r>
+    </w:p>
+    <w:p>
+      <w:pPr>
         <w:rPr>
           <w:rFonts w:eastAsiaTheme="minorEastAsia"/>
         </w:rPr>
-        <w:t>).</w:t>
-      </w:r>
-    </w:p>
-    <w:p>
-      <w:pPr>
-        <w:rPr>
-          <w:rFonts w:eastAsiaTheme="minorEastAsia"/>
-        </w:rPr>
       </w:pPr>
     </w:p>
     <w:p>
@@ -2987,272 +2925,6 @@
       </w:pPr>
       <w:r>
         <w:lastRenderedPageBreak/>
-        <w:t>Euclidian Heur</w:t>
-      </w:r>
-      <w:r>
-        <w:t>i</w:t>
-      </w:r>
-      <w:r>
-        <w:t>stic</w:t>
-      </w:r>
-    </w:p>
-    <w:p>
-      <w:r>
-        <w:t>While less optimal than the Manhattan heuristic on a 4-connected grid, the Euclidian heuristic was also chosen as it shares similarly the fast, consistent and admissible properties of the Manhattan heuristic</w:t>
-      </w:r>
-      <w:r>
-        <w:t>.</w:t>
-      </w:r>
-      <w:r>
-        <w:t xml:space="preserve"> The Euclidian heuristic may be defined as follows:</w:t>
-      </w:r>
-    </w:p>
-    <w:p>
-      <m:oMathPara>
-        <m:oMath>
-          <m:r>
-            <w:rPr>
-              <w:rFonts w:ascii="Cambria Math" w:hAnsi="Cambria Math"/>
-            </w:rPr>
-            <m:t>h</m:t>
-          </m:r>
-          <m:d>
-            <m:dPr>
-              <m:ctrlPr>
-                <w:rPr>
-                  <w:rFonts w:ascii="Cambria Math" w:hAnsi="Cambria Math"/>
-                  <w:i/>
-                </w:rPr>
-              </m:ctrlPr>
-            </m:dPr>
-            <m:e>
-              <m:r>
-                <w:rPr>
-                  <w:rFonts w:ascii="Cambria Math" w:hAnsi="Cambria Math"/>
-                </w:rPr>
-                <m:t>n</m:t>
-              </m:r>
-            </m:e>
-          </m:d>
-          <m:r>
-            <w:rPr>
-              <w:rFonts w:ascii="Cambria Math" w:hAnsi="Cambria Math"/>
-            </w:rPr>
-            <m:t>=</m:t>
-          </m:r>
-          <m:rad>
-            <m:radPr>
-              <m:degHide m:val="1"/>
-              <m:ctrlPr>
-                <w:rPr>
-                  <w:rFonts w:ascii="Cambria Math" w:hAnsi="Cambria Math"/>
-                  <w:i/>
-                </w:rPr>
-              </m:ctrlPr>
-            </m:radPr>
-            <m:deg/>
-            <m:e>
-              <m:sSup>
-                <m:sSupPr>
-                  <m:ctrlPr>
-                    <w:rPr>
-                      <w:rFonts w:ascii="Cambria Math" w:hAnsi="Cambria Math"/>
-                      <w:i/>
-                    </w:rPr>
-                  </m:ctrlPr>
-                </m:sSupPr>
-                <m:e>
-                  <m:d>
-                    <m:dPr>
-                      <m:ctrlPr>
-                        <w:rPr>
-                          <w:rFonts w:ascii="Cambria Math" w:hAnsi="Cambria Math"/>
-                          <w:i/>
-                        </w:rPr>
-                      </m:ctrlPr>
-                    </m:dPr>
-                    <m:e>
-                      <m:sSub>
-                        <m:sSubPr>
-                          <m:ctrlPr>
-                            <w:rPr>
-                              <w:rFonts w:ascii="Cambria Math" w:hAnsi="Cambria Math"/>
-                              <w:i/>
-                            </w:rPr>
-                          </m:ctrlPr>
-                        </m:sSubPr>
-                        <m:e>
-                          <m:r>
-                            <w:rPr>
-                              <w:rFonts w:ascii="Cambria Math" w:hAnsi="Cambria Math"/>
-                            </w:rPr>
-                            <m:t>x</m:t>
-                          </m:r>
-                        </m:e>
-                        <m:sub>
-                          <m:r>
-                            <w:rPr>
-                              <w:rFonts w:ascii="Cambria Math" w:hAnsi="Cambria Math"/>
-                            </w:rPr>
-                            <m:t>n</m:t>
-                          </m:r>
-                        </m:sub>
-                      </m:sSub>
-                      <m:r>
-                        <w:rPr>
-                          <w:rFonts w:ascii="Cambria Math" w:hAnsi="Cambria Math"/>
-                        </w:rPr>
-                        <m:t>-</m:t>
-                      </m:r>
-                      <m:sSub>
-                        <m:sSubPr>
-                          <m:ctrlPr>
-                            <w:rPr>
-                              <w:rFonts w:ascii="Cambria Math" w:hAnsi="Cambria Math"/>
-                              <w:i/>
-                            </w:rPr>
-                          </m:ctrlPr>
-                        </m:sSubPr>
-                        <m:e>
-                          <m:r>
-                            <w:rPr>
-                              <w:rFonts w:ascii="Cambria Math" w:hAnsi="Cambria Math"/>
-                            </w:rPr>
-                            <m:t>x</m:t>
-                          </m:r>
-                        </m:e>
-                        <m:sub>
-                          <m:r>
-                            <w:rPr>
-                              <w:rFonts w:ascii="Cambria Math" w:hAnsi="Cambria Math"/>
-                            </w:rPr>
-                            <m:t>goal</m:t>
-                          </m:r>
-                        </m:sub>
-                      </m:sSub>
-                    </m:e>
-                  </m:d>
-                </m:e>
-                <m:sup>
-                  <m:r>
-                    <w:rPr>
-                      <w:rFonts w:ascii="Cambria Math" w:hAnsi="Cambria Math"/>
-                    </w:rPr>
-                    <m:t>2</m:t>
-                  </m:r>
-                </m:sup>
-              </m:sSup>
-              <m:r>
-                <w:rPr>
-                  <w:rFonts w:ascii="Cambria Math" w:hAnsi="Cambria Math"/>
-                </w:rPr>
-                <m:t>+</m:t>
-              </m:r>
-              <m:sSup>
-                <m:sSupPr>
-                  <m:ctrlPr>
-                    <w:rPr>
-                      <w:rFonts w:ascii="Cambria Math" w:hAnsi="Cambria Math"/>
-                      <w:i/>
-                    </w:rPr>
-                  </m:ctrlPr>
-                </m:sSupPr>
-                <m:e>
-                  <m:d>
-                    <m:dPr>
-                      <m:ctrlPr>
-                        <w:rPr>
-                          <w:rFonts w:ascii="Cambria Math" w:hAnsi="Cambria Math"/>
-                          <w:i/>
-                        </w:rPr>
-                      </m:ctrlPr>
-                    </m:dPr>
-                    <m:e>
-                      <m:sSub>
-                        <m:sSubPr>
-                          <m:ctrlPr>
-                            <w:rPr>
-                              <w:rFonts w:ascii="Cambria Math" w:hAnsi="Cambria Math"/>
-                              <w:i/>
-                            </w:rPr>
-                          </m:ctrlPr>
-                        </m:sSubPr>
-                        <m:e>
-                          <m:r>
-                            <w:rPr>
-                              <w:rFonts w:ascii="Cambria Math" w:hAnsi="Cambria Math"/>
-                            </w:rPr>
-                            <m:t>y</m:t>
-                          </m:r>
-                        </m:e>
-                        <m:sub>
-                          <m:r>
-                            <w:rPr>
-                              <w:rFonts w:ascii="Cambria Math" w:hAnsi="Cambria Math"/>
-                            </w:rPr>
-                            <m:t>n</m:t>
-                          </m:r>
-                        </m:sub>
-                      </m:sSub>
-                      <m:r>
-                        <w:rPr>
-                          <w:rFonts w:ascii="Cambria Math" w:hAnsi="Cambria Math"/>
-                        </w:rPr>
-                        <m:t>-</m:t>
-                      </m:r>
-                      <m:sSub>
-                        <m:sSubPr>
-                          <m:ctrlPr>
-                            <w:rPr>
-                              <w:rFonts w:ascii="Cambria Math" w:hAnsi="Cambria Math"/>
-                              <w:i/>
-                            </w:rPr>
-                          </m:ctrlPr>
-                        </m:sSubPr>
-                        <m:e>
-                          <m:r>
-                            <w:rPr>
-                              <w:rFonts w:ascii="Cambria Math" w:hAnsi="Cambria Math"/>
-                            </w:rPr>
-                            <m:t>y</m:t>
-                          </m:r>
-                        </m:e>
-                        <m:sub>
-                          <m:r>
-                            <w:rPr>
-                              <w:rFonts w:ascii="Cambria Math" w:hAnsi="Cambria Math"/>
-                            </w:rPr>
-                            <m:t>goal</m:t>
-                          </m:r>
-                        </m:sub>
-                      </m:sSub>
-                    </m:e>
-                  </m:d>
-                </m:e>
-                <m:sup>
-                  <m:r>
-                    <w:rPr>
-                      <w:rFonts w:ascii="Cambria Math" w:hAnsi="Cambria Math"/>
-                    </w:rPr>
-                    <m:t>2</m:t>
-                  </m:r>
-                </m:sup>
-              </m:sSup>
-            </m:e>
-          </m:rad>
-        </m:oMath>
-      </m:oMathPara>
-    </w:p>
-    <w:p>
-      <w:r>
-        <w:t>&lt;&lt;figure out how to show consistency / admissibility&gt;&gt;</w:t>
-      </w:r>
-    </w:p>
-    <w:p>
-      <w:pPr>
-        <w:pStyle w:val="Heading5"/>
-      </w:pPr>
-      <w:r>
         <w:t>CNN Heuristic</w:t>
       </w:r>
     </w:p>
@@ -3285,13 +2957,8 @@
         <w:t xml:space="preserve"> and </w:t>
       </w:r>
       <w:r>
-        <w:t xml:space="preserve">Takuya </w:t>
-      </w:r>
-      <w:proofErr w:type="spellStart"/>
-      <w:r>
-        <w:t>Narihira</w:t>
-      </w:r>
-      <w:proofErr w:type="spellEnd"/>
+        <w:t>Takuya Narihira</w:t>
+      </w:r>
       <w:r>
         <w:t xml:space="preserve"> showed that a small encoder-decoder neural network could be used to generate heuristic maps to inform A* search algorithms on a small </w:t>
       </w:r>
@@ -3364,15 +3031,7 @@
         <w:t>channel one</w:t>
       </w:r>
       <w:r>
-        <w:t xml:space="preserve"> is </w:t>
-      </w:r>
-      <w:proofErr w:type="spellStart"/>
-      <w:r>
-        <w:t>a</w:t>
-      </w:r>
-      <w:proofErr w:type="spellEnd"/>
-      <w:r>
-        <w:t xml:space="preserve"> binary obstacle map (0 for empty space, 1 for walls)</w:t>
+        <w:t xml:space="preserve"> is a binary obstacle map (0 for empty space, 1 for walls)</w:t>
       </w:r>
       <w:r>
         <w:t>,</w:t>
@@ -3384,15 +3043,7 @@
         <w:t xml:space="preserve">and, channel three </w:t>
       </w:r>
       <w:r>
-        <w:t xml:space="preserve">is a </w:t>
-      </w:r>
-      <w:proofErr w:type="spellStart"/>
-      <w:r>
-        <w:t>euclidian</w:t>
-      </w:r>
-      <w:proofErr w:type="spellEnd"/>
-      <w:r>
-        <w:t xml:space="preserve"> distance map from the goal point</w:t>
+        <w:t>is a euclidian distance map from the goal point</w:t>
       </w:r>
       <w:r>
         <w:t xml:space="preserve"> (Figure 1</w:t>
@@ -3425,6 +3076,9 @@
         <w:jc w:val="center"/>
       </w:pPr>
       <w:r>
+        <w:rPr>
+          <w:noProof/>
+        </w:rPr>
         <w:drawing>
           <wp:inline distT="0" distB="0" distL="0" distR="0" wp14:anchorId="633049B1" wp14:editId="58AE4582">
             <wp:extent cx="5079188" cy="3664528"/>
@@ -3612,31 +3266,7 @@
         <w:t>ing</w:t>
       </w:r>
       <w:r>
-        <w:t xml:space="preserve"> a </w:t>
-      </w:r>
-      <w:proofErr w:type="spellStart"/>
-      <w:r>
-        <w:t>strided</w:t>
-      </w:r>
-      <w:proofErr w:type="spellEnd"/>
-      <w:r>
-        <w:t xml:space="preserve"> 3×3 conv </w:t>
-      </w:r>
-      <w:proofErr w:type="spellStart"/>
-      <w:r>
-        <w:t>downsample</w:t>
-      </w:r>
-      <w:proofErr w:type="spellEnd"/>
-      <w:r>
-        <w:t xml:space="preserve"> followed by two dilated 3×3 </w:t>
-      </w:r>
-      <w:proofErr w:type="spellStart"/>
-      <w:r>
-        <w:t>convs</w:t>
-      </w:r>
-      <w:proofErr w:type="spellEnd"/>
-      <w:r>
-        <w:t>, all with BatchNorm and leaky ReLU</w:t>
+        <w:t xml:space="preserve"> a strided 3×3 conv downsample followed by two dilated 3×3 convs, all with BatchNorm and leaky ReLU</w:t>
       </w:r>
       <w:r>
         <w:t>;</w:t>
@@ -3651,28 +3281,17 @@
         <w:t>ing</w:t>
       </w:r>
       <w:r>
-        <w:t xml:space="preserve"> a 4×4 transposed conv </w:t>
-      </w:r>
-      <w:proofErr w:type="spellStart"/>
-      <w:r>
-        <w:t>upsample</w:t>
-      </w:r>
-      <w:proofErr w:type="spellEnd"/>
-      <w:r>
-        <w:t xml:space="preserve"> followed by two 3×3 </w:t>
-      </w:r>
-      <w:proofErr w:type="spellStart"/>
-      <w:r>
-        <w:t>convs</w:t>
-      </w:r>
-      <w:proofErr w:type="spellEnd"/>
-      <w:r>
-        <w:t xml:space="preserve"> with BatchNorm and leaky ReLU; a final 1×1 conv produces the single output channel.</w:t>
+        <w:t xml:space="preserve"> a 4×4 transposed conv upsample followed by two 3×3 convs with BatchNorm and leaky ReLU; a final 1×1 conv produces the single output channel.</w:t>
       </w:r>
     </w:p>
     <w:p>
       <w:r>
         <w:t>The CNN heuristic cannot be considered admissible or consistent.</w:t>
+      </w:r>
+    </w:p>
+    <w:p>
+      <w:r>
+        <w:br w:type="page"/>
       </w:r>
     </w:p>
     <w:p>
@@ -3684,6 +3303,33 @@
         <w:t>Experimental Results</w:t>
       </w:r>
     </w:p>
+    <w:p>
+      <w:r>
+        <w:t xml:space="preserve">Example, </w:t>
+      </w:r>
+      <w:r>
+        <w:t xml:space="preserve">Algorithm, Heuristic, </w:t>
+      </w:r>
+      <w:r>
+        <w:t>Path Cost, Optimal,</w:t>
+      </w:r>
+      <w:r>
+        <w:t xml:space="preserve"> States Explored, Time taken, </w:t>
+      </w:r>
+      <w:r>
+        <w:t>Image</w:t>
+      </w:r>
+    </w:p>
+    <w:p/>
+    <w:p/>
+    <w:p/>
+    <w:p/>
+    <w:p/>
+    <w:p/>
+    <w:p/>
+    <w:p/>
+    <w:p/>
+    <w:p/>
     <w:p>
       <w:pPr>
         <w:pStyle w:val="ListParagraph"/>
@@ -3846,15 +3492,7 @@
         <w:fldChar w:fldCharType="separate"/>
       </w:r>
       <w:r>
-        <w:t xml:space="preserve">Ariki, Y., &amp; </w:t>
-      </w:r>
-      <w:proofErr w:type="spellStart"/>
-      <w:r>
-        <w:t>Narihira</w:t>
-      </w:r>
-      <w:proofErr w:type="spellEnd"/>
-      <w:r>
-        <w:t xml:space="preserve">, T. (2019). </w:t>
+        <w:t xml:space="preserve">Ariki, Y., &amp; Narihira, T. (2019). </w:t>
       </w:r>
       <w:r>
         <w:rPr>
@@ -3864,15 +3502,7 @@
         <w:t>Fully Convolutional Search Heuristic Learning for Rapid Path Planners</w:t>
       </w:r>
       <w:r>
-        <w:t xml:space="preserve"> (No. arXiv:1908.03343). </w:t>
-      </w:r>
-      <w:proofErr w:type="spellStart"/>
-      <w:r>
-        <w:t>arXiv</w:t>
-      </w:r>
-      <w:proofErr w:type="spellEnd"/>
-      <w:r>
-        <w:t>. https://doi.org/10.48550/arXiv.1908.03343</w:t>
+        <w:t xml:space="preserve"> (No. arXiv:1908.03343). arXiv. https://doi.org/10.48550/arXiv.1908.03343</w:t>
       </w:r>
     </w:p>
     <w:p>
@@ -3882,42 +3512,209 @@
       <w:r>
         <w:t xml:space="preserve">Bhardwaj, M. (2025). </w:t>
       </w:r>
-      <w:proofErr w:type="spellStart"/>
       <w:r>
         <w:rPr>
           <w:i/>
           <w:iCs/>
         </w:rPr>
-        <w:t>Mohakbhardwaj</w:t>
-      </w:r>
-      <w:proofErr w:type="spellEnd"/>
-      <w:r>
-        <w:rPr>
-          <w:i/>
-          <w:iCs/>
-        </w:rPr>
-        <w:t>/</w:t>
-      </w:r>
-      <w:proofErr w:type="spellStart"/>
-      <w:r>
-        <w:rPr>
-          <w:i/>
-          <w:iCs/>
-        </w:rPr>
-        <w:t>motion_planning_datasets</w:t>
-      </w:r>
-      <w:proofErr w:type="spellEnd"/>
+        <w:t>Mohakbhardwaj/motion_planning_datasets</w:t>
+      </w:r>
       <w:r>
         <w:t xml:space="preserve"> [Computer software]. https://github.com/mohakbhardwaj/motion_planning_datasets (Original work published 2017)</w:t>
       </w:r>
     </w:p>
     <w:p>
+      <w:pPr>
+        <w:sectPr>
+          <w:pgSz w:w="11906" w:h="16838"/>
+          <w:pgMar w:top="720" w:right="720" w:bottom="720" w:left="720" w:header="708" w:footer="708" w:gutter="0"/>
+          <w:cols w:space="708"/>
+          <w:docGrid w:linePitch="360"/>
+        </w:sectPr>
+      </w:pPr>
       <w:r>
         <w:fldChar w:fldCharType="end"/>
       </w:r>
     </w:p>
+    <w:p>
+      <w:pPr>
+        <w:pStyle w:val="Heading1"/>
+      </w:pPr>
+      <w:r>
+        <w:lastRenderedPageBreak/>
+        <w:t>Appendix A</w:t>
+      </w:r>
+    </w:p>
+    <w:p>
+      <w:r>
+        <w:t>Example, Algorithm, Heuristic, Path Cost, Optimal, States Explored, Time taken, Im</w:t>
+      </w:r>
+    </w:p>
+    <w:tbl>
+      <w:tblPr>
+        <w:tblStyle w:val="TableGrid"/>
+        <w:tblW w:w="0" w:type="auto"/>
+        <w:tblLook w:val="04A0" w:firstRow="1" w:lastRow="0" w:firstColumn="1" w:lastColumn="0" w:noHBand="0" w:noVBand="1"/>
+      </w:tblPr>
+      <w:tblGrid>
+        <w:gridCol w:w="1413"/>
+        <w:gridCol w:w="2977"/>
+        <w:gridCol w:w="1134"/>
+        <w:gridCol w:w="2259"/>
+        <w:gridCol w:w="1943"/>
+        <w:gridCol w:w="1967"/>
+        <w:gridCol w:w="1908"/>
+        <w:gridCol w:w="1787"/>
+      </w:tblGrid>
+      <w:tr>
+        <w:tc>
+          <w:tcPr>
+            <w:tcW w:w="1413" w:type="dxa"/>
+          </w:tcPr>
+          <w:p>
+            <w:r>
+              <w:t>Example</w:t>
+            </w:r>
+          </w:p>
+        </w:tc>
+        <w:tc>
+          <w:tcPr>
+            <w:tcW w:w="2977" w:type="dxa"/>
+          </w:tcPr>
+          <w:p>
+            <w:r>
+              <w:t>Algorithm</w:t>
+            </w:r>
+          </w:p>
+        </w:tc>
+        <w:tc>
+          <w:tcPr>
+            <w:tcW w:w="1134" w:type="dxa"/>
+          </w:tcPr>
+          <w:p>
+            <w:r>
+              <w:t>Heuristic</w:t>
+            </w:r>
+          </w:p>
+        </w:tc>
+        <w:tc>
+          <w:tcPr>
+            <w:tcW w:w="2259" w:type="dxa"/>
+          </w:tcPr>
+          <w:p>
+            <w:r>
+              <w:t>Path Cost</w:t>
+            </w:r>
+          </w:p>
+        </w:tc>
+        <w:tc>
+          <w:tcPr>
+            <w:tcW w:w="1943" w:type="dxa"/>
+          </w:tcPr>
+          <w:p>
+            <w:r>
+              <w:t>Is Optimal</w:t>
+            </w:r>
+          </w:p>
+        </w:tc>
+        <w:tc>
+          <w:tcPr>
+            <w:tcW w:w="1967" w:type="dxa"/>
+          </w:tcPr>
+          <w:p>
+            <w:r>
+              <w:t>States Explored</w:t>
+            </w:r>
+          </w:p>
+        </w:tc>
+        <w:tc>
+          <w:tcPr>
+            <w:tcW w:w="1908" w:type="dxa"/>
+          </w:tcPr>
+          <w:p>
+            <w:r>
+              <w:t>Time Taken</w:t>
+            </w:r>
+          </w:p>
+        </w:tc>
+        <w:tc>
+          <w:tcPr>
+            <w:tcW w:w="1787" w:type="dxa"/>
+          </w:tcPr>
+          <w:p>
+            <w:r>
+              <w:t>Visualisation</w:t>
+            </w:r>
+          </w:p>
+        </w:tc>
+      </w:tr>
+      <w:tr>
+        <w:tc>
+          <w:tcPr>
+            <w:tcW w:w="1413" w:type="dxa"/>
+          </w:tcPr>
+          <w:p>
+            <w:r>
+              <w:t>Maze1.txt</w:t>
+            </w:r>
+          </w:p>
+        </w:tc>
+        <w:tc>
+          <w:tcPr>
+            <w:tcW w:w="2977" w:type="dxa"/>
+          </w:tcPr>
+          <w:p>
+            <w:r>
+              <w:t>Iterative depth-first search</w:t>
+            </w:r>
+          </w:p>
+        </w:tc>
+        <w:tc>
+          <w:tcPr>
+            <w:tcW w:w="1134" w:type="dxa"/>
+          </w:tcPr>
+          <w:p>
+            <w:r>
+              <w:t>N/A</w:t>
+            </w:r>
+          </w:p>
+        </w:tc>
+        <w:tc>
+          <w:tcPr>
+            <w:tcW w:w="2259" w:type="dxa"/>
+          </w:tcPr>
+          <w:p/>
+        </w:tc>
+        <w:tc>
+          <w:tcPr>
+            <w:tcW w:w="1943" w:type="dxa"/>
+          </w:tcPr>
+          <w:p/>
+        </w:tc>
+        <w:tc>
+          <w:tcPr>
+            <w:tcW w:w="1967" w:type="dxa"/>
+          </w:tcPr>
+          <w:p/>
+        </w:tc>
+        <w:tc>
+          <w:tcPr>
+            <w:tcW w:w="1908" w:type="dxa"/>
+          </w:tcPr>
+          <w:p/>
+        </w:tc>
+        <w:tc>
+          <w:tcPr>
+            <w:tcW w:w="1787" w:type="dxa"/>
+          </w:tcPr>
+          <w:p/>
+        </w:tc>
+      </w:tr>
+    </w:tbl>
+    <w:p/>
+    <w:p/>
     <w:sectPr>
-      <w:pgSz w:w="11906" w:h="16838"/>
+      <w:pgSz w:w="16838" w:h="11906" w:orient="landscape"/>
       <w:pgMar w:top="720" w:right="720" w:bottom="720" w:left="720" w:header="708" w:footer="708" w:gutter="0"/>
       <w:cols w:space="708"/>
       <w:docGrid w:linePitch="360"/>
@@ -4822,7 +4619,7 @@
   <w:style w:type="paragraph" w:default="1" w:styleId="Normal">
     <w:name w:val="Normal"/>
     <w:qFormat/>
-    <w:rsid w:val="00DD1D99"/>
+    <w:rsid w:val="009E3561"/>
     <w:rPr>
       <w:rFonts w:ascii="Arial" w:hAnsi="Arial" w:cs="Arial"/>
     </w:rPr>
@@ -5020,6 +4817,7 @@
   <w:style w:type="character" w:default="1" w:styleId="DefaultParagraphFont">
     <w:name w:val="Default Paragraph Font"/>
     <w:uiPriority w:val="1"/>
+    <w:semiHidden/>
     <w:unhideWhenUsed/>
   </w:style>
   <w:style w:type="table" w:default="1" w:styleId="TableNormal">

</xml_diff>